<commit_message>
Proofcheck Inn Trouble Czech: SIGNIFICANT (33 fixes)
Co-Authored-By: Claude Opus 5.5 <noreply@anthropic.com>
Claude-Session: https://claude.ai/code/session_012Cm8JxdqzjuttdUSdkQCUg
</commit_message>
<xml_diff>
--- a/translated/corrected/Inn Trouble - ASSEMBLED - FORMATTED_Czech.docx
+++ b/translated/corrected/Inn Trouble - ASSEMBLED - FORMATTED_Czech.docx
@@ -139,7 +139,7 @@
     <w:p/>
     <w:p>
       <w:r>
-        <w:t>Někdo si při lampičce přečetl sto let staré tajemství a rozhodl se ho prodat. Dokázat to bude Jessicu stát nejteplejší týden, jaký tu za poslední roky zažila — a odpouštění, jak tu zjišťuje, není totéž co zapomínání.</w:t>
+        <w:t>Někdo si při lampičce přečetl sto let staré tajemství a rozhodl se ho prodat. Dokázat to bude Jessicu stát nejteplejší týden, jaký město za poslední roky zažilo – a odpouštění, jak tu zjišťuje, není totéž co zapomínání.</w:t>
       </w:r>
     </w:p>
     <w:p>
@@ -450,7 +450,7 @@
     <w:p/>
     <w:p>
       <w:r>
-        <w:t xml:space="preserve">Telefonát přišel následující ráno, když jsem měla ruce hluboko v těstě na koláč, a věděla jsem, že je zle, ještě než jsem si je stačila utřít, protože v naší chalupě telefon téměř nikdy nezvonil. Lidé chodili většinou osobně, nebo poslali dítě s vzkazem, případně vás zastihli na trhu. Když už zazvonil, bývala to obvykle Olivia, která chtěla vědět, jestli jsem neviděla tu novou merino vlnu, co jim přivezli, nebo Martha, jež mi připomínala, odpoledne kterého dne se schází kroužek. Když tedy v půl deváté šedivého rána pronikavě zazvonil v tiché kuchyni, sevřel se mi žaludek dřív, než jsem vůbec přešla místnost.</w:t>
+        <w:t xml:space="preserve">Telefonát přišel následující ráno, když jsem měla ruce hluboko v těstě na koláč, a věděla jsem, že je zle, ještě než jsem si je stačila utřít, protože v naší chalupě telefon téměř nikdy nezvonil. Lidé chodili většinou osobně, nebo poslali dítě se vzkazem, případně vás zastihli na trhu. Když už zazvonil, bývala to obvykle Olivia, která chtěla vědět, jestli jsem neviděla tu novou merino vlnu, co jim přivezli, nebo Martha, jež mi připomínala, odpoledne kterého dne se schází kroužek. Když tedy v půl deváté šedivého rána pronikavě zazvonil v tiché kuchyni, sevřel se mi žaludek dřív, než jsem vůbec přešla místnost.</w:t>
       </w:r>
     </w:p>
     <w:p/>
@@ -462,7 +462,7 @@
     <w:p/>
     <w:p>
       <w:r>
-        <w:t>„Prosím?“ přitiskla jsem sluchátko k rameni a otírala si mouku z rukou do zástěry.</w:t>
+        <w:t>„Prosím?“ Přitiskla jsem sluchátko k rameni a otírala si mouku z rukou do zástěry.</w:t>
       </w:r>
     </w:p>
     <w:p/>
@@ -657,7 +657,7 @@
     <w:p/>
     <w:p>
       <w:r>
-        <w:t xml:space="preserve">„Ale copak nechápeš?“ zavrtěla hlavou, zoufalá. „Nezáleží na tom, co je na mně pravdivé. Záleží jen na tom, co mohou říct. Jestli se to dostane ven, zničí to všechno. Jméno hostince. Jméno mé rodiny. Sto let práce pryč kvůli holce, kterou jsem nikdy nepotkala, a věci, kterou jsem nikdy neudělala.“ Ukázala na vzkaz. „A teď to někdo ví. Někdo to ví, Jessico, a já nechápu jak, protože ten kufr mám zamčený na půdě a jsem jediný žijící člověk, který ho kdy otevřel. Jediný. Takže jak?“</w:t>
+        <w:t xml:space="preserve">„Ale copak nechápeš?“ Zavrtěla hlavou, zoufalá. „Nezáleží na tom, co je na mně pravdivé. Záleží jen na tom, co mohou říct. Jestli se to dostane ven, zničí to všechno. Jméno hostince. Jméno mé rodiny. Sto let práce pryč kvůli holce, kterou jsem nikdy nepotkala, a věci, kterou jsem nikdy neudělala.“ Ukázala na vzkaz. „A teď to někdo ví. Někdo to ví, Jessico, a já nechápu jak, protože ten kufr mám zamčený na půdě a jsem jediný žijící člověk, který ho kdy otevřel. Jediný. Takže jak?“</w:t>
       </w:r>
     </w:p>
     <w:p/>
@@ -699,7 +699,7 @@
     <w:p/>
     <w:p>
       <w:r>
-        <w:t>„Kde končí staré papíry tohohle města, Fiono? Nakonec? Když jsou rodiny, které ho vlastnily, pryč nebo ho nechtějí mít pod nohama?“</w:t>
+        <w:t>„Kde končí staré papíry tohohle města, Fiono? Nakonec? Když jsou rodiny, které je vlastnily, pryč nebo je nechtějí mít pod nohama?“</w:t>
       </w:r>
     </w:p>
     <w:p/>
@@ -932,7 +932,7 @@
     <w:p/>
     <w:p>
       <w:r>
-        <w:t xml:space="preserve">Tehdy v noci, před spaním, jsem zašla k oknu – jako vždycky –, abych se podívala na město, které se chystá ke spánku. Naše chalupa stála trochu stranou od ostatních, nahoře u cesty, s ohradou a tmavým obrysem dílny za ní a pod tím se rozprostíralo město. Město zářilo.</w:t>
+        <w:t xml:space="preserve">Tehdy v noci, před spaním, jsem zašla k oknu – jako vždycky –, abych se podívala na město, které se chystá ke spánku. Naše chalupa stála trochu stranou od ostatních, nahoře u cesty, s výběhem a tmavým obrysem dílny za ní a pod tím se rozprostíralo město. Město zářilo.</w:t>
       </w:r>
     </w:p>
     <w:p/>
@@ -1016,7 +1016,7 @@
     <w:p/>
     <w:p>
       <w:r>
-        <w:t xml:space="preserve">Stáli jsme tam ještě chvíli, pozorovali zlaté město a pak šli nahoru do postele. Dlouho jsem ležela vzhůru v temnotě a v hlavě držela dvě věci najednou. Někde dole ve Frost Falls stál člověk mezi krabicemi Blackburnových a našel způsob, jak sevřít ruku kolem hrdla hodné ženy kvůli půl milionu dolarů. A venku za ohradou stavěl můj manžel překvapení, které nechtěl pojmenovat, zatímco světla sama od sebe zlátla a magie, kterou jsme si přivezli s sebou, pátrala tmou po místě, kde by mohla přistát.</w:t>
+        <w:t xml:space="preserve">Stáli jsme tam ještě chvíli, pozorovali zlaté město a pak šli nahoru do postele. Dlouho jsem ležela vzhůru v temnotě a v hlavě držela dvě věci najednou. Někde dole ve Frost Falls stál člověk mezi krabicemi Blackburnových a našel způsob, jak sevřít ruku kolem hrdla hodné ženy kvůli půl milionu dolarů. A venku za výběhem stavěl můj manžel překvapení, které nechtěl pojmenovat, zatímco světla sama od sebe zlátla a magie, kterou jsme si přivezli s sebou, pátrala tmou po místě, kde by mohla přistát.</w:t>
       </w:r>
     </w:p>
     <w:p/>
@@ -1054,7 +1054,7 @@
     <w:p/>
     <w:p>
       <w:r>
-        <w:t>Uvnitř byly všechny stěny zaplněné výstavou. Místo vybledlých map a jízdního řádu železnice z roku 1911 teď stěny zdobily zarámované dopisy, fotografie a zažloutlé kupní smlouvy. Každý exponát nesl popisek psaný drobným, úhledným a mírně se svažujícím písmem, který jsem poznala, dřív než jsem si přečetla jediné slovo, protože jsem ho vídala na kartičkách v dětském koutku i na cedulkách v muzejních vitrínách. Theovo písmo. Popisoval úplně všechno. Kdyby mu to prošlo, popsal by i ten mošt.</w:t>
+        <w:t>Uvnitř byly všechny stěny zaplněné výstavou. Místo vybledlých map a jízdního řádu železnice z roku 1911 teď stěny zdobily zarámované dopisy, fotografie a zažloutlé listiny. Každý exponát nesl popisek psaný drobným, úhledným a mírně se svažujícím písmem, který jsem poznala, dřív než jsem si přečetla jediné slovo, protože jsem ho vídala na kartičkách v dětském koutku i na cedulkách v muzejních vitrínách. Theovo písmo. Popisoval úplně všechno. Kdyby mu to prošlo, popsal by i ten mošt.</w:t>
       </w:r>
     </w:p>
     <w:p/>
@@ -1066,7 +1066,7 @@
     <w:p/>
     <w:p>
       <w:r>
-        <w:t xml:space="preserve">Na každého, kdo prošel, se upřímně a zářivě usmíval, občas oběma rukama, a vysokému muži v péřovce vyprávěl něco o smlouvách, což dotyčného přimělo přikyvovat a couvat pryč po centimetrech. Mezi jednotlivými pozdravy však v té půlvteřině, kdy si myslel, že se nikdo nedívá, úsměv z jeho tváře opadl jako něco příliš těžkého na udržení a to, co se ukrylo pod ním, mě přimělo zůstat stát na místě. Kůže v obličeji mu zšedla. Pod očima měl fialové stíny hluboké jako modřiny. Kravatu měl uvázanou o čtvrt otočky nakřivo a na jedné čočce brýlí lpěla šmouha od palce, které si už neměl dost pozornosti všimnout, natož ji setřít. Urovnal si kravatu. O chvíli později si ji urovnal znovu, úplně stejným gestem, jako by zapomněl, že to před chvílí udělal.</w:t>
+        <w:t xml:space="preserve">Na každého, kdo prošel, se upřímně a zářivě usmíval, občas oběma rukama, a vysokému muži v péřovce vyprávěl něco o listinách, což dotyčného přimělo přikyvovat a couvat pryč po centimetrech. Mezi jednotlivými pozdravy však v té půlvteřině, kdy si myslel, že se nikdo nedívá, úsměv z jeho tváře opadl jako něco příliš těžkého na udržení a to, co se ukrylo pod ním, mě přimělo zůstat stát na místě. Kůže v obličeji mu zšedla. Pod očima měl fialové stíny hluboké jako modřiny. Kravatu měl uvázanou o čtvrt otočky nakřivo a na jedné čočce brýlí lpěla šmouha od palce, které si už neměl dost pozornosti všimnout, natož ji setřít. Urovnal si kravatu. O chvíli později si ji urovnal znovu, úplně stejným gestem, jako by zapomněl, že to před chvílí udělal.</w:t>
       </w:r>
     </w:p>
     <w:p/>
@@ -1198,7 +1198,7 @@
     <w:p/>
     <w:p>
       <w:r>
-        <w:t>Poté jsem se pomalu vmísila mezi lidi. Obdivovala jsem staré smlouvy s Dot, která celou věc okomentovala slovy, že je to „moc povyku kvůli cizí poště“, a přesto tam ještě hodinu zůstala. Nechala jsem Thea, aby mě provedl třemi vitrínami, a pozorovala jsem, jak se jich dotýká – nebo spíše nedotýká, jeho prsty se vznášely nad sklem každé z nich jako ruka držená nad zády spícího dítěte, aby cítila jeho dech, aniž by ho probudila. A celou tu dobu jsem sledovala místnost.</w:t>
+        <w:t>Poté jsem se pomalu vmísila mezi lidi. Obdivovala jsem staré listiny s Dot, která celou věc okomentovala slovy, že je to „moc povyku kvůli cizí poště“, a přesto tam ještě hodinu zůstala. Nechala jsem Thea, aby mě provedl třemi vitrínami, a pozorovala jsem, jak se jich dotýká – nebo spíše nedotýká, jeho prsty se vznášely nad sklem každé z nich jako ruka držená nad zády spícího dítěte, aby cítila jeho dech, aniž by ho probudila. A celou tu dobu jsem sledovala místnost.</w:t>
       </w:r>
     </w:p>
     <w:p/>
@@ -1848,7 +1848,7 @@
     <w:p/>
     <w:p>
       <w:r>
-        <w:t>Sam Patel stál u kovadliny. V kleštích svíral plochou železnou hvězdu, jejíž jeden cíp se v jádru oranžově leskl, a opracovával ji krátkými, rovnoměrnými údery, přičemž ji mezi každým úderem o kousek pootočil. Zpočátku si mě nevšiml a já na něj nespěchala. Pip se batolila až k okraji teplého kruhu, který vrhval oheň, a tam se zastavila, rozumný pták, a sedla si s nakloněnou hlavičkou, aby sledovala oranžové světlo.</w:t>
+        <w:t>Sam Patel stál u kovadliny. V kleštích svíral plochou železnou hvězdu, jejíž jeden cíp se v jádru oranžově leskl, a opracovával ji krátkými, rovnoměrnými údery, přičemž ji mezi každým úderem o kousek pootočil. Zpočátku si mě nevšiml a já na něj nespěchala. Pip se batolila až k okraji teplého kruhu, který vrhal oheň, a tam se zastavila, rozumný pták, a sedla si s nakloněnou hlavičkou, aby sledovala oranžové světlo.</w:t>
       </w:r>
     </w:p>
     <w:p/>
@@ -2408,7 +2408,7 @@
     </w:p>
     <w:p>
       <w:r>
-        <w:t xml:space="preserve">Žena, na kterou doléhají finanční potíže. Žena, která má v rukou klíče k celému století vlastnických vztahů, k listinám hostince </w:t>
+        <w:t xml:space="preserve">Žena, na kterou doléhají finanční potíže. Žena, která má v rukou klíče k celému století vlastnických vztahů, k listině hostince </w:t>
       </w:r>
       <w:r>
         <w:t xml:space="preserve"/>
@@ -2620,7 +2620,7 @@
     <w:p/>
     <w:p>
       <w:r>
-        <w:t>Řekl to zlehka, aniž by tušil, že mi tím něco prozradil, a já udržela klidný obličej nad tím tichým, čistým cvaknutím, které to ve mně vydalo. Ty dopisy nečetl. Krabice nosil s pohledem upřeným na vlastní nohy. Ať už vyděrač v Blackburnových listinách četl cokoli, o té broži, tom kameni, zastavárně – Jamal to nikdy neměl před očima. Měl to v náruči, zavřené v krabici, a nikdy se dovnitř nepodíval.</w:t>
+        <w:t>Řekl to zlehka, aniž by tušil, že mi tím něco prozradil, a já udržela klidný obličej nad tím tichým, čistým cvaknutím, které to ve mně vydalo. Ty dopisy nečetl. Krabice nosil s pohledem upřeným na vlastní nohy. Ať už vyděrač v Blackburnových písemnostech četl cokoli, o té broži, tom kameni, zastavárně – Jamal to nikdy neměl před očima. Měl to v náruči, zavřené v krabici, a nikdy se dovnitř nepodíval.</w:t>
       </w:r>
     </w:p>
     <w:p/>
@@ -2721,7 +2721,7 @@
     <w:p/>
     <w:p>
       <w:r>
-        <w:t>Venku na návsi to byl pro změnu Bramův kříž. Prancer se v noci sama pustila z ohrady a došla dolů do města, kde stála po kotníky ve spadaném listí v nádrži kašny, kterou město každý rok v říjnu vypínalo. Stála tam s hlavou vztyčenou a odmítala se hnout.</w:t>
+        <w:t>Venku na návsi to byl pro změnu Bramův kříž. Prancer se v noci sama pustila z výběhu a došla dolů do města, kde stála po kotníky ve spadaném listí v nádrži kašny, kterou město každý rok v říjnu vypínalo. Stála tam s hlavou vztyčenou a odmítala se hnout.</w:t>
       </w:r>
     </w:p>
     <w:p/>
@@ -2869,7 +2869,7 @@
     <w:p/>
     <w:p>
       <w:r>
-        <w:t xml:space="preserve">„Když už mluvíme o Společnosti,“ promluvila Ivy, „byl u ještě někoho ten chlápek z knihovny?“</w:t>
+        <w:t xml:space="preserve">„Když už mluvíme o Společnosti,“ promluvila Ivy, „byl ještě u někoho ten chlápek z knihovny?“</w:t>
       </w:r>
     </w:p>
     <w:p/>
@@ -2989,7 +2989,7 @@
     <w:p/>
     <w:p>
       <w:r>
-        <w:t>„Matka mu říká Max,“ sledovala mě Dot. „Každá učitelka v té škole mu říká Max. Mohla sis ušetřit šest písmen.“</w:t>
+        <w:t>„Matka mu říká Max,“ řekla Dot a sledovala mě. „Každá učitelka v té škole mu říká Max. Mohla sis ušetřit šest písmen.“</w:t>
       </w:r>
     </w:p>
     <w:p/>
@@ -3084,7 +3084,7 @@
     <w:p/>
     <w:p>
       <w:r>
-        <w:t>„Zbývají dva.“ Podívala jsem se na papír a strašně se mi nechtělo. Vera. Theo. Dvě jména, přes která jsem nedokázala natáhnout čáru. „A toho se děsím. Ze všech na tomhle seznamu jsou jediní dva, které nedokážu očistit, ti, co drží klíče od starých městských listin. Vera má na starosti kupní smlouvy a pozemkové knihy, celé století toho, co komu patřilo, a někde mezi tím leží i listina k hostinci. Ztuhla tenkrát jako solný sloup a tvrdila mi, že ty papíry, které má přímo za zády, nikdy nečte. A Theo.“ Donutila jsem se to říct pomalu. „Theo žije v archivu. Blackburnovy dopisy byly v jeho péči, v jeho rukou. A ty nejzajímavější z nich, přesně ty, které by prozradily, že se ztratila brož a kam se poděla, jsou ty, kvůli kterým se postavil před celé město a oznámil, že se ztratily.“</w:t>
+        <w:t>„Zbývají dva.“ Podívala jsem se na papír a strašně se mi nechtělo. Vera. Theo. Dvě jména, přes která jsem nedokázala natáhnout čáru. „A toho se děsím. Ze všech na tomhle seznamu jsou jediní dva, které nedokážu očistit, ti, co drží klíče od starých městských písemností. Vera má na starosti listiny a majetkové záznamy, celé století toho, co komu patřilo, a někde mezi tím leží i listina k hostinci. Ztuhla tenkrát jako solný sloup a tvrdila mi, že ty papíry, které má přímo za zády, nikdy nečte. A Theo.“ Donutila jsem se to říct pomalu. „Theo žije v archivu. Blackburnovy dopisy byly v jeho péči, v jeho rukou. A ty nejzajímavější z nich, přesně ty, které by prozradily, že se ztratila brož a kam se poděla, jsou ty, kvůli kterým se postavil před celé město a oznámil, že se ztratily.“</w:t>
       </w:r>
     </w:p>
     <w:p/>
@@ -3108,7 +3108,7 @@
     <w:p/>
     <w:p>
       <w:r>
-        <w:t xml:space="preserve">„Tak to prověř,“ řekl Nick, „místo aby ses tady v kuchyni trápila, což nikdy nic nevyřešilo a ani nevyřeší. Běž a podívej se na jedinou věc, na kterou ses pořádně nepodívala. Na ty dopisy samotné, nebo na místo, kde by měly být.“ Natáhl se přes stůl a položil svou teplou ruku na moji promrzlou. „Theo by určitě uvítal pomocnou ruku při srovnávání toho archivu do pořádku. Běž mu ji nabídnout. A až budeš pomáhat, zjisti jedinou věc. Jestli se slova v tom vzkazu shodují se slovy v dopisech, které se ztratily. Protože jestli ano, Jess, pak ten, kdo ten vzkaz napsal, nečetl Blackburnovy listiny jen tak obecně. Měl ty přesné dopisy v rukou. A ve Frost Falls žije jen velmi krátký seznam lidí, o kterých se to dá říct.“</w:t>
+        <w:t xml:space="preserve">„Tak to prověř,“ řekl Nick, „místo aby ses tady v kuchyni trápila, což nikdy nic nevyřešilo a ani nevyřeší. Běž a podívej se na jedinou věc, na kterou ses pořádně nepodívala. Na ty dopisy samotné, nebo na místo, kde by měly být.“ Natáhl se přes stůl a položil svou teplou ruku na moji promrzlou. „Theo by určitě uvítal pomocnou ruku při srovnávání toho archivu do pořádku. Běž mu ji nabídnout. A až budeš pomáhat, zjisti jedinou věc. Jestli se slova v tom vzkazu shodují se slovy v dopisech, které se ztratily. Protože jestli ano, Jess, pak ten, kdo ten vzkaz napsal, nečetl Blackburnovy písemnosti jen tak obecně. Měl ty přesné dopisy v rukou. A ve Frost Falls žije jen velmi krátký seznam lidí, o kterých se to dá říct.“</w:t>
       </w:r>
     </w:p>
     <w:p/>
@@ -3250,13 +3250,13 @@
     <w:p/>
     <w:p>
       <w:r>
-        <w:t>„Skutečná firma,“ spustila, ještě než jsem vůbec stihla říct haló. „Stará, dva státy odtud, dělá přesně to, co tvůj muž říká, že dělá – pozůstalosti, dědictví a pátrání po ztraceném majetku pro právníky, co mají víc peněz než času. A vážně tu je Blackburnova pozůstalost, Jessiko, skutečná, aktuální. Poslední z linie Adelaide Blackburnové zemřela dole ve městě letos na jaře, žádné děti, žádná kloudná závěť a zbylo z toho neskutečné klubko. Náš starosta je z příbuzenské větve, z té, co po nich zdědila akorát tak nos, ale peníze ani náhodou. Do toho on není zapletený. Carter je vedený v účetnictví firmy jako rešeršér, kterého najali, aby se v tom probral. Vytáhla jsem to z jedné úřednice, která mi to celé potvrdila, aniž by si byť jen jednou uvědomila, že něco potvrzuje. Je přesně, do puntíku tím, za co se ti vydával. Pátrač s licencí a výdajovým účtem.“</w:t>
-      </w:r>
-    </w:p>
-    <w:p/>
-    <w:p>
-      <w:r>
-        <w:t>Takže když jsem Neila následující ráno našla, jak sedí u svého stolu v knihovně mezi otevřenými krabicemi, posadila jsem se naproti němu, v duchu už téměř rozhodnutá, a usmyslela si, že obětuji kousek pravdy, abych si koupila ten zbytek.</w:t>
+        <w:t>„Skutečná firma,“ spustila, ještě než jsem vůbec stihla říct haló. „Stará, dva státy odtud, dělá přesně to, co ten tvůj chlapík říká, že dělá – pozůstalosti, dědictví a pátrání po ztraceném majetku pro právníky, co mají víc peněz než času. A vážně tu je Blackburnova pozůstalost, Jessiko, skutečná, aktuální. Poslední z linie Adelaide Blackburnové zemřela dole ve městě letos na jaře, žádné děti, žádná kloudná závěť a zbylo z toho neskutečné klubko. Náš starosta je z příbuzenské větve, z té, co po nich zdědila akorát tak nos, ale peníze ani náhodou. Do toho on není zapletený. Carter je vedený v účetnictví firmy jako rešeršér, kterého najali, aby se v tom probral. Vytáhla jsem to z jedné úřednice, která mi to celé potvrdila, aniž by si byť jen jednou uvědomila, že něco potvrzuje. Je přesně, do puntíku tím, za co se ti vydával. Pátrač s licencí a výdajovým účtem.“</w:t>
+      </w:r>
+    </w:p>
+    <w:p/>
+    <w:p>
+      <w:r>
+        <w:t>Takže když jsem Neila následující ráno našla, jak sedí u svého stolu v knihovně mezi otevřenými krabicemi, posadila jsem se naproti němu, v duchu už téměř jistá, a usmyslela si, že obětuji kousek pravdy, abych si koupila ten zbytek.</w:t>
       </w:r>
     </w:p>
     <w:p/>
@@ -3369,7 +3369,7 @@
     <w:p/>
     <w:p>
       <w:r>
-        <w:t xml:space="preserve">Archiv byla dlouhá zadní místnost za výstavní síní, od podlahy až ke stropu lemovaná archivními krabicemi, a byl to, jak Theo na vernisáži přiznal celému městu, úchvatný ztroskotaný vrak. Přivítal mě tam šedivý a vděčný, ve stejné nakřivo uvázané kravatě, a posadil mě k pracovnímu stolu roztřiďovat balík domácích písemností, zatímco on pracoval na druhém konci místnosti. Dobrou hodinu jsme pracovali v družném tichu dvou lidí, kteří oba milují pořádek a které zároveň, každého svým způsobem, uklidňuje jeho vytváření. Pip zaujala stanoviště na nízké hromadě krabic vedle mě a bedlivě střežila mosazné kancelářské sponky v mém podnosu. Tu hodinu jsem si dovolila téměř zapomenout, proč jsem sem přišla.</w:t>
+        <w:t xml:space="preserve">Archivem byla dlouhá zadní místnost za výstavní síní, od podlahy až ke stropu lemovaná archivními krabicemi, a byl to, jak Theo na vernisáži přiznal celému městu, úchvatný ztroskotaný vrak. Přivítal mě tam šedivý a vděčný, ve stejné nakřivo uvázané kravatě, a posadil mě k pracovnímu stolu roztřiďovat balík domácích písemností, zatímco on pracoval na druhém konci místnosti. Dobrou hodinu jsme pracovali v družném tichu dvou lidí, kteří oba milují pořádek a které zároveň, každého svým způsobem, uklidňuje jeho vytváření. Pip zaujala stanoviště na nízké hromadě krabic vedle mě a bedlivě střežila mosazné kancelářské sponky v mém podnosu. Tu hodinu jsem si dovolila téměř zapomenout, proč jsem sem přišla.</w:t>
       </w:r>
     </w:p>
     <w:p/>
@@ -3405,7 +3405,7 @@
         <w:rPr>
           <w:i/>
         </w:rPr>
-        <w:t xml:space="preserve">Korespondence, Adelaide Blackburnová její sestře, zima 1924. Týká se: krádeže rodinné brože (safír v jejím srdci) služebnictvem; předmět později zastaven v Ridgeline. Značného místního významu.</w:t>
+        <w:t xml:space="preserve">Korespondence, Adelaide Blackburnová své sestře, zima 1924. Týká se: krádeže rodinné brože (safír v jejím srdci) služebnictvem; předmět později zastaven v Ridgeline. Značného místního významu.</w:t>
       </w:r>
     </w:p>
     <w:p/>
@@ -3429,7 +3429,7 @@
     <w:p/>
     <w:p>
       <w:r>
-        <w:t xml:space="preserve">A ten vzkaz byl psán Theovou rukou.</w:t>
+        <w:t xml:space="preserve">A ten lístek byl psán Theovou rukou.</w:t>
       </w:r>
     </w:p>
     <w:p/>
@@ -3471,7 +3471,7 @@
     <w:p/>
     <w:p>
       <w:r>
-        <w:t xml:space="preserve">„Vím, že to vzešlo od něj nebo přes něj,“ můj hlas zněl drsně. „Vím, že kdokoli ten vzkaz napsal, četl Theova vlastní slova o té broži. A vím, že existuje jen krátký seznam lidí, kteří k nim měli přístup, a jeho jméno stojí na samém vrcholu, vymalované červenou tužkou, jeho vlastním písmem.“ Přitáhla jsem si deku blíž. „Pořád ho vidím stát před chvílí u dveří. Čtyřicet nových členů. Tak šťastného. Nicku, jak to může člověk udělat? Jak může tohle provést Fioně ve stínu a ráno dětem přinést kakao a myslet obojí vážně, ve stejný týden, stejnýma rukama?“</w:t>
+        <w:t xml:space="preserve">„Vím, že to vzešlo od něj nebo přes něj.“ Hlas mi zněl drsně. „Vím, že kdokoli ten vzkaz napsal, četl Theova vlastní slova o té broži. A vím, že existuje jen krátký seznam lidí, kteří k nim měli přístup, a jeho jméno stojí na samém vrcholu, vymalované červenou tužkou, jeho vlastním písmem.“ Přitáhla jsem si deku blíž. „Pořád ho vidím stát před chvílí u dveří. Čtyřicet nových členů. Tak šťastného. Nicku, jak to může člověk udělat? Jak může tohle provést Fioně ve stínu a ráno dětem přinést kakao a myslet obojí vážně, ve stejný týden, stejnýma rukama?“</w:t>
       </w:r>
     </w:p>
     <w:p/>
@@ -3638,7 +3638,7 @@
     <w:p/>
     <w:p>
       <w:r>
-        <w:t xml:space="preserve">Nebyla to velká útěcha, ale byla to pravda a Fiona se toho chytila jako tonoucí stébla. „Mluvíš, jako bys věděla, kdo to je,“ podívala se mi do tváře očima lemovanýma červeným okrajem. „Víš to? Vypadáš tak. Martha říká, že míváš ten výraz.“</w:t>
+        <w:t xml:space="preserve">Nebyla to velká útěcha, ale byla to pravda a Fiona se toho chytila jako tonoucí stébla. „Mluvíš, jako bys věděla, kdo to je,“ řekla a pozorovala mou tvář očima lemovanýma červeným okrajem. „Víš to? Vypadáš tak. Martha říká, že míváš ten výraz.“</w:t>
       </w:r>
     </w:p>
     <w:p/>
@@ -4042,7 +4042,7 @@
     <w:p/>
     <w:p>
       <w:r>
-        <w:t>Theo měl krádež na svědomí. Našel ji v Blackburnových dopisech, brož, kámen, zastavárnu. Pečlivým písmem ji zanesl do katalogu, safír v jejím srdci, a pak ty dopisy vytáhl ze spisů a označil je za pohřešované. Ale Theo, který se potápěl pod hladinou, sledovaný celým městem, a který nebyl nikdy doma, nemohl udělat zbytek. Nemohl potvrdit, že hostinec byl koupen za ty peníze, protože ten důkaz v jeho budově nebyl. A nemohl roznést vzkazy napříč městem a položit jeden na přeplněný stůl za bílého dne uprostřed slavností, protože Theo Hussein se nemohl projít po Evergreen Avenue bez povšimnutí, ani kdyby mu to zachránilo život.</w:t>
+        <w:t>Theo měl krádež. Našel ji v Blackburnových dopisech, brož, kámen, zastavárnu. Pečlivým písmem ji zanesl do katalogu, safír v jejím srdci, a pak ty dopisy vytáhl ze spisů a označil je za pohřešované. Ale Theo, který se potápěl pod hladinou, sledovaný celým městem, a který nebyl nikdy doma, nemohl udělat zbytek. Nemohl potvrdit, že hostinec byl koupen za ty peníze, protože ten důkaz v jeho budově nebyl. A nemohl roznést vzkazy napříč městem a položit jeden na přeplněný stůl za bílého dne uprostřed slavností, protože Theo Hussein se nemohl projít po Evergreen Avenue bez povšimnutí, ani kdyby mu to zachránilo život.</w:t>
       </w:r>
     </w:p>
     <w:p/>
@@ -4369,7 +4369,7 @@
     <w:p/>
     <w:p>
       <w:r>
-        <w:t xml:space="preserve">„Theo,“ řekla jsem. „Vyděračské vzkazy Fioně byly napsané na hlavičkovém papíře Společnosti. Na tom silném krémovém papíře se žebrováním. Srovnala jsem jeho strukturu vlákno po vláknu s archem z tvých zásob.“ Cuknul s sebou, ale já pokračovala dál, pevně. „A popisují brož jako ‚safír v jejím srdci‘. To jsou tvoje slova, Theo. Jsou na tvé katalogové kartě, tvou vlastní rukou, na kartě k dopisům Blackburnových, o nichž jsi celému městu na zahájení tvrdil, že se ztratily. Dopisy se neztratily. Vytáhl jsi je, protože v sobě nesly tajemství, a pak jsi je prohlásil za ztracené, aby se nikdo neodvážil pátrat po tom, co v nich stálo.“ Odmlčela jsem se a nechala tu další část zaznít tiše. „Našel jsi způsob, jak těmi dopisy zachránit Společnost. A popadl jsi ho. Že ano?“</w:t>
+        <w:t xml:space="preserve">„Theo,“ řekla jsem. „Vyděračské vzkazy Fioně byly napsané na dopisním papíře Společnosti. Na tom silném krémovém papíře se žebrováním. Srovnala jsem jeho strukturu vlákno po vláknu s archem z tvých zásob.“ Cuknul s sebou, ale já pokračovala dál, pevně. „A popisují brož jako ‚safír v jejím srdci‘. To jsou tvoje slova, Theo. Jsou na tvé katalogové kartě, tvou vlastní rukou, na kartě k dopisům Blackburnových, o nichž jsi celému městu na zahájení tvrdil, že se ztratily. Dopisy se neztratily. Vytáhl jsi je, protože v sobě nesly tajemství, a pak jsi je prohlásil za ztracené, aby nikoho ani nenapadlo zeptat se, co v nich stálo.“ Odmlčela jsem se a nechala tu další část zaznít tiše. „Našel jsi způsob, jak těmi dopisy zachránit Společnost. A popadl jsi ho. Že ano?“</w:t>
       </w:r>
     </w:p>
     <w:p/>
@@ -4381,7 +4381,7 @@
     <w:p/>
     <w:p>
       <w:r>
-        <w:t xml:space="preserve">„Namlouval jsem si, že to vlastně není krádež,“ řekl. „Ne od Fiony. Namlouval jsem si, že ten hostinec byl stejně pořízený z ukradených peněz, takže vzít si z toho zpátky jen kousek nebyla krádež, byla to, já nevím, náprava historie, účet, který se konečně vyrovnává. Jsem tak dobrý v tom, že přinutím minulost znamenat cokoli, co zrovna potřebuju. To je celá moje průprava, dávat minulosti smysl.“ Zabořil si pěsti do očí jako dítě. „Střecha nám padá na hlavu. Kotel umírá. Sto let paměti tohohle města, každý dopis, každá fotografie a listina, všechno to jde vniveč a každé poctivé dveře, na které jsem zaklepal, mi zabouchli před nosem, starosta, dotace, nadace, všechny do jednoho. A pak jsem našel ty dopisy, a byl tam, půl milionu dolarů, jen tak ležel v minulosti, a já si pomyslel, já to můžu zachránit. Můžu zachránit úplně všechno, každý kousek, a nikdo vlastně nebude zraněný, protože ty peníze byly už na začátku špinavé.“ Vzhlédl, zbědovaný. „A pak jsem sledoval, co to s ní dělá. S Fionou. Sledoval jsem, jak šediví. A namlouval jsem si, že přestanu, a nepřestal jsem, protože v té době už jsem v tom vězel, a když už jsem to udělal jednou, říkal jsem si, že na jednom dalším nezáleží.“ Otočil se k Fioně a hlas se mu zlomil. „Je mi to tak líto. Je mi to tak líto, Fiono. Někde v tom všem jsem se ztratil. Mám historii tohohle města tak strašně rád, až jsem zapomněl, že město je tvořené živými lidmi.“</w:t>
+        <w:t xml:space="preserve">„Namlouval jsem si, že to vlastně není krádež,“ řekl. „Ne Fioně. Namlouval jsem si, že ten hostinec byl stejně pořízený z ukradených peněz, takže vzít si z toho zpátky jen kousek nebyla krádež, byla to, já nevím, náprava historie, účet, který se konečně vyrovnává. Jsem tak dobrý v tom, že přinutím minulost znamenat cokoli, co zrovna potřebuju. To je celá moje průprava, dávat minulosti smysl.“ Zabořil si pěsti do očí jako dítě. „Střecha nám padá na hlavu. Kotel umírá. Sto let paměti tohohle města, každý dopis, každá fotografie a listina, všechno to jde vniveč a každé poctivé dveře, na které jsem zaklepal, mi zabouchli před nosem, starosta, dotace, nadace, všechny do jednoho. A pak jsem našel ty dopisy, a byl tam, půl milionu dolarů, jen tak ležel v minulosti, a já si pomyslel, já to můžu zachránit. Můžu zachránit úplně všechno, každý kousek, a nikdo vlastně nebude zraněný, protože ty peníze byly už na začátku špinavé.“ Vzhlédl, zbědovaný. „A pak jsem sledoval, co to s ní dělá. S Fionou. Sledoval jsem, jak šediví. A namlouval jsem si, že přestanu, a nepřestal jsem, protože v té době už jsem v tom vězel, a když už jsem to udělal jednou, říkal jsem si, že na jednom dalším nezáleží.“ Otočil se k Fioně a hlas se mu zlomil. „Je mi to tak líto. Je mi to tak líto, Fiono. Někde v tom všem jsem se ztratil. Mám historii tohohle města tak strašně rád, až jsem zapomněl, že město je tvořené živými lidmi.“</w:t>
       </w:r>
     </w:p>
     <w:p/>
@@ -4399,7 +4399,7 @@
     <w:p/>
     <w:p>
       <w:r>
-        <w:t xml:space="preserve">„Vero,“ řekla jsem. „Theo měl na starosti krádež. Ale ty vzkazy věděly, že hostinec byl koupený za peníze z té brože, a to v žádném dopise Blackburnových nikdy nebylo. To je majetkový záznam. Listina. A listina k tomuto hostinci ležela včera ráno vytažená ze zásuvky ve vašem košíku na vrácení, ohmataná, na stole ženy, která mi dvakrát řekla, že do záznamů za svými zády nikdy nenahlíží.“ Hlas jsem udržela měkký. „On měl krádež. Vy jste měla listinu. A vy jste měla nohy, Vero. On by nedokázal projít tímhle městem bez povšimnutí, ani kdyby šlo o život, Thea zná každý, každý ho zastaví. Ale nad tím, že se sekretářka starosty během festivalu zastaví v hostinci, nikdo ani nemrkne. Sama jsem vás toho rána potkala na schodech s parkovacími povolenkami. On by to sám nedokázal. Potřeboval někoho, kdo se dokáže městem pohybovat nepozorovaně. To jste byla vy.“</w:t>
+        <w:t xml:space="preserve">„Vero,“ řekla jsem. „Theo měl krádež. Ale ty vzkazy věděly, že hostinec byl koupený za peníze z té brože, a to v žádném dopise Blackburnových nikdy nebylo. To je majetkový záznam. Listina. A listina k tomuto hostinci ležela včera ráno vytažená ze zásuvky ve vašem košíku na vrácení, ohmataná, na stole ženy, která mi dvakrát řekla, že do záznamů za svými zády nikdy nenahlíží.“ Hlas jsem udržela měkký. „On měl krádež. Vy jste měla listinu. A vy jste měla nohy, Vero. On by nedokázal projít tímhle městem bez povšimnutí, ani kdyby šlo o život, Thea zná každý, každý ho zastaví. Ale nad tím, že se sekretářka starosty během festivalu zastaví v hostinci, nikdo ani nemrkne. Sama jsem vás toho rána potkala na schodech s parkovacími povolenkami. On by to sám nedokázal. Potřeboval někoho, kdo se dokáže městem pohybovat nepozorovaně. To jste byla vy.“</w:t>
       </w:r>
     </w:p>
     <w:p/>
@@ -4828,7 +4828,7 @@
     <w:p/>
     <w:p>
       <w:r>
-        <w:t xml:space="preserve">O chvíli později přiběhl Bram přes náves a ždímal si čepici a za ním samozřejmě kráčel sob. Tentokrát Dancer, která se zase dostala z ohrady a vydala se po stopách lampionů dolů do města. Stála uprostřed návsi, na parůžcích se jí třpytila námraza a s mírným, nenuceným zájmem pozorovala vyhrabanou měděnou krabici, zatímco stovka měšťanů zírala a jedno malé děvčátko hlasitě vykřiklo čistou radostí.</w:t>
+        <w:t xml:space="preserve">O chvíli později přiběhl Bram přes náves a ždímal si čepici a za ním samozřejmě kráčel sob. Tentokrát Dancer, která se zase dostala z výběhu a vydala se po stopách lampionů dolů do města. Stála uprostřed návsi, na parůžcích se jí třpytila námraza a s mírným, nenuceným zájmem pozorovala vyhrabanou měděnou krabici, zatímco stovka měšťanů zírala a jedno malé děvčátko hlasitě vykřiklo čistou radostí.</w:t>
       </w:r>
     </w:p>
     <w:p/>
@@ -4846,7 +4846,7 @@
     <w:p/>
     <w:p>
       <w:r>
-        <w:t xml:space="preserve">Stála jsem tam na návsi a rozhlížela se kolem: na jilm a zlatavá světla, zelenou měděnou krabici, soba, smějící se dítě a celé město shromážděné v záři lampionů. Pip odešla stát přímo pod čumák Dancer a věnovala sobovi dlouhý, přísný pohled, jako by jí chtěla připomenout, čí je to tu tučňák. Nickova ruka našla moji. Za ohradou stálo ohniště, které postavil pro magii, a já přemýšlela, kolik dalšího z ní tam bude kroužit, až se vrátíme domů.</w:t>
+        <w:t xml:space="preserve">Stála jsem tam na návsi a rozhlížela se kolem: na jilm a zlatavá světla, zelenou měděnou krabici, soba, smějící se dítě a celé město shromážděné v záři lampionů. Pip odešla stát přímo pod čumák Dancer a věnovala sobovi dlouhý, přísný pohled, jako by jí chtěla připomenout, čí je to tu tučňák. Nickova ruka našla moji. Za výběhem stálo ohniště, které postavil pro magii, a já přemýšlela, kolik dalšího z ní tam bude kroužit, až se vrátíme domů.</w:t>
       </w:r>
     </w:p>
     <w:p/>
@@ -5202,7 +5202,7 @@
     <w:p/>
     <w:p>
       <w:r>
-        <w:t xml:space="preserve">Dot se zasmála svým krátkým, suchým smíchem z druhého konce kroužku, aniž zvedla zrak od svého věnce, který byl už teď o polovinu větší než kdokoli jiného a dvakrát tak hustý. „Jde po tvé fintě ode dne, kdy jsi sem vkročila. Po té mojí šla v roce devatenáct set osmdesát něco.“ Dot byla statná a šedivá a říkala toho hodně v hodně málo slovech. V tomto obchodě vázala věnce desítky let. Bylo to vidět na jejích rukou. Nikdy se nezastavily a nikdy nezaváhaly.</w:t>
+        <w:t xml:space="preserve">Dot se zasmála svým krátkým, suchým smíchem z druhého konce kroužku, aniž zvedla zrak od svého věnce, který byl už teď o polovinu větší než věnec kohokoli jiného a dvakrát tak hustý. „Jde po tvé fintě ode dne, kdy jsi sem vkročila. Po té mojí šla v roce devatenáct set osmdesát něco.“ Dot byla statná a šedivá a říkala toho hodně v hodně málo slovech. V tomto obchodě vázala věnce desítky let. Bylo to vidět na jejích rukou. Nikdy se nezastavily a nikdy nezaváhaly.</w:t>
       </w:r>
     </w:p>
     <w:p/>

</xml_diff>

<commit_message>
Full proofcheck Inn Trouble Czech: SIGNIFICANT (46 edits)
Co-Authored-By: Claude Opus 5.5 <noreply@anthropic.com>
Claude-Session: https://claude.ai/code/session_012Cm8JxdqzjuttdUSdkQCUg
</commit_message>
<xml_diff>
--- a/translated/corrected/Inn Trouble - ASSEMBLED - FORMATTED_Czech.docx
+++ b/translated/corrected/Inn Trouble - ASSEMBLED - FORMATTED_Czech.docx
@@ -149,12 +149,12 @@
     </w:p>
     <w:p>
       <w:r>
-        <w:t>Koláč byl ještě teplý, když jsem ho zvedala do košíku – tak teplý, že pára zamlžila vnitřek chladného kuchyňského okna a celá místnost voněla skořicí, jablky a třtinovým cukrem, jejž jsem nechala zezlátnout o chlup víc, než bylo zdrávo, protože to tak Fiona měla ráda. Kdysi mi vyprávěla, že její maminka pálila cukr úmyslně, přesně na tu hranici, kde přestává být sladký a začíná mít hlubší chuť. Vůně takového cukru prý byla vůní malého, bezpečného světa v teplé kuchyni za chladného dne. Od té doby jsem ho pro ni takhle peklá.</w:t>
-      </w:r>
-    </w:p>
-    <w:p>
-      <w:r>
-        <w:t>Zastrčila jsem pod mísu kostkovanou utěrku a stlačila její okraje. Pak jsem se podívala na Pip, která zaujala stanovisko u zadních dveří s nezaměnitelným výrazem tvora, jemuž byl slíben výlet a hodlá ho do puntíku vymámit.</w:t>
+        <w:t>Koláč byl ještě teplý, když jsem ho zvedala do košíku – tak teplý, že pára zamlžila vnitřek chladného kuchyňského okna a celá místnost voněla skořicí, jablky a třtinovým cukrem, jejž jsem nechala zezlátnout o chlup déle než do zlatova, protože to tak Fiona měla ráda. Kdysi mi vyprávěla, že její maminka pálila cukr úmyslně, přesně na tu hranici, kde přestává být sladký a začíná mít hlubší chuť. Vůně takového cukru prý byla vůní malého, bezpečného světa v teplé kuchyni za chladného dne. Od té doby jsem ho pro ni takhle pekla.</w:t>
+      </w:r>
+    </w:p>
+    <w:p>
+      <w:r>
+        <w:t>Zastrčila jsem kolem mísy kostkovanou utěrku a stlačila její okraje. Pak jsem se podívala na Pip, která zaujala stanovisko u zadních dveří s nezaměnitelným výrazem tvora, jemuž byl slíben výlet a hodlá ho do puntíku vymámit.</w:t>
       </w:r>
     </w:p>
     <w:p>
@@ -164,7 +164,7 @@
     </w:p>
     <w:p>
       <w:r>
-        <w:t xml:space="preserve">Jednou si pískla – tím krátkým, ostrým písknutím, které znamenalo pohněte sebou –, otřásla ocasními pery a vykolébala se na verandu v okamžiku, kdy jsem otevřela dveře, jako by to byla ona, kdo čekal na mě, a ne naopak.</w:t>
+        <w:t xml:space="preserve">Jednou si pískla – tím krátkým, ostrým písknutím, které znamenalo pohni sebou –, otřásla ocasními pery a vykolébala se na verandu v okamžiku, kdy jsem otevřela dveře, jako by to byla ona, kdo čekal na mě, a ne naopak.</w:t>
       </w:r>
     </w:p>
     <w:p>
@@ -224,12 +224,12 @@
     </w:p>
     <w:p>
       <w:r>
-        <w:t xml:space="preserve">„Vždycky musela,“ odvětila jsem a natáhla košík. „Jablečný. Okraj je přiškvařený, tak jak to máš ráda. Nehádej se se mnou, vlekla jsem ho s sebou celou třídou a Pip se pokusila sníst tvůj věnec, takže mě to stálo nervy.“</w:t>
-      </w:r>
-    </w:p>
-    <w:p>
-      <w:r>
-        <w:t xml:space="preserve">To vyloudilo poloviční úsměv, což bylo aspoň něco. Vzala si košík a přitiskla si ho k tělu oběma pažemi, jako dítě tisknoucí láhev s horkou vodou. Přes jeho okraj jí zrak těkal kolem mého ramene ke dveřím, vracel se a zase těkal dál. Hlídala dveře. Ten pohled jsem znala. Za svůj život jsem přečetla velkou řádku dopisů od lidí, kteří tráví dny hlídáním dveří a čekáním na to, čeho se nejvíc děsí, a ten pohled se časem vryje do těla. Teď vězel ve Fionině těle.</w:t>
+        <w:t xml:space="preserve">„Vždycky bych měla,“ odvětila jsem a natáhla košík. „Jablečný. Okraj je přiškvařený, tak jak to máš ráda. Nehádej se se mnou, vlekla jsem ho s sebou celou třídou a Pip se pokusila sníst tvůj věnec, takže mě to stálo nervy.“</w:t>
+      </w:r>
+    </w:p>
+    <w:p>
+      <w:r>
+        <w:t xml:space="preserve">To vyloudilo poloviční úsměv, což bylo aspoň něco. Vzala si košík a přitiskla si ho k tělu oběma pažemi, jako dítě tisknoucí termofor. Přes jeho okraj jí zrak těkal kolem mého ramene ke dveřím, vracel se a zase těkal dál. Hlídala dveře. Ten pohled jsem znala. Za svůj život jsem přečetla velkou řádku dopisů od lidí, kteří tráví dny hlídáním dveří a čekáním na to, čeho se nejvíc děsí, a ten pohled se časem vryje do těla. Teď vězel ve Fionině těle.</w:t>
       </w:r>
     </w:p>
     <w:p>
@@ -314,7 +314,7 @@
     </w:p>
     <w:p>
       <w:r>
-        <w:t xml:space="preserve">„Krásná práce, to kování.“ Ten neznámý byl úhledný, s jasnýma očima a někde uprostřed padesátky, dobře oblečený tím lehce zmačkaným způsobem cestovatele. V ruce držel malý zápisník, který se ani nesnažil skrývat. Kývnul za Samem. „Místní kovář? Místní práci vždycky poznáte. Je v ní jistota. A tenhle dům.“ Otočil se, aniž spěchal, aby obsáhl halu, zatočené schodiště, starý sádcový medailon uprostřed stropu. „Tohle je dům s historií. Rodinný podnik, hádám. Po generace.“</w:t>
+        <w:t xml:space="preserve">„Krásná práce, to kování.“ Ten neznámý byl úhledný, s jasnýma očima a někde uprostřed padesátky, dobře oblečený tím lehce zmačkaným způsobem cestovatele. V ruce držel malý zápisník, který se ani nesnažil skrývat. Kývnul za Samem. „Místní kovář? Místní práci vždycky poznáte. Je v ní jistota. A tenhle dům.“ Otočil se, aniž spěchal, aby obsáhl halu, zatočené schodiště, starý sádrový medailon uprostřed stropu. „Tohle je dům s historií. Rodinný podnik, hádám. Po generace.“</w:t>
       </w:r>
     </w:p>
     <w:p>
@@ -389,7 +389,7 @@
     </w:p>
     <w:p>
       <w:r>
-        <w:t xml:space="preserve">Venku byl chlad úlevou po dusném, hřejivém neklidu haly. Chvíli jsem stála u zábradlí na verandě a nechala si tím vyčistit hlavu. Dole na návsi muži na žebřících natahovali festivalová světla mezi stožáry pouličního osvětlení a pokřikovali na sebe. Někde směrem k parku štěkal pes a vlak při vjezdu do stanice zahoukal v dáli. Všechno to bylo tak obyčejné, že to znepokojivé ve Fionině tváři se na okamžik zdála být jen něčím, co jsem si představovala.</w:t>
+        <w:t xml:space="preserve">Venku byl chlad úlevou po dusném, hřejivém neklidu haly. Chvíli jsem stála u zábradlí na verandě a nechala si tím vyčistit hlavu. Dole na návsi muži na žebřících natahovali festivalová světla mezi stožáry pouličního osvětlení a pokřikovali na sebe. Někde směrem k parku štěkal pes a vlak při vjezdu do stanice zahoukal v dáli. Všechno to bylo tak obyčejné, že to znepokojivé ve Fionině tváři se na okamžik zdálo být jen něčím, co jsem si představovala.</w:t>
       </w:r>
     </w:p>
     <w:p>
@@ -546,7 +546,7 @@
     <w:p/>
     <w:p>
       <w:r>
-        <w:t>Vzala jsem je a nejdřív rozvinula papír. Byl na tom hůř.</w:t>
+        <w:t>Vzala jsem je a nejdřív rozvinula papír. Byl horší z těch dvou.</w:t>
       </w:r>
     </w:p>
     <w:p/>
@@ -558,7 +558,7 @@
         <w:rPr>
           <w:i/>
         </w:rPr>
-        <w:t xml:space="preserve">Vím, jak vaše rodina přišla k tomuto hostinci. Vím o broži, kterou vaše prababička vzala Blackburnovým – safír v jejím srdci – a o krámku v Ridgeline, kde ji prodala, aby si mohla koupit tohle místo. Zaplaťte, nebo se celé město dozví pravdu. Nechte peníze pod předními schody hostince. Sundejte zlatou stuhu z věnce a dejte místo ní červenou, abych věděl, že peníze jsou tam.</w:t>
+        <w:t xml:space="preserve">Vím, jak vaše rodina přišla k tomuto hostinci. Vím o broži, kterou vaše prababička vzala Blackburnovým – safír v jejím srdci – a o krámku v Ridgeline, kde ji prodala, aby si mohla koupit tohle místo. Zaplaťte, nebo se celé město dozví pravdu. Nechte peníze pod předními schody hostince. Sundejte zlatou stuhu z věnce a dejte místo ní červenou, ať vím, že peníze jsou tam.</w:t>
       </w:r>
     </w:p>
     <w:p/>
@@ -687,7 +687,7 @@
     <w:p/>
     <w:p>
       <w:r>
-        <w:t xml:space="preserve">„Tak přemýšlej chvíli se mnou,“ řekla jsem, „protože na tomhle záleží víc než na čemkoliv jiném. Kdo tenhle vzkaz napsal, ví, co bylo v tom zamčeném kufru. A existují jen dva způsoby, jak může člověk zjistit, co je v zamčeném kufru, který jsi otevřela jen ty. Buď se ti do toho kufru nějak podařilo vniknout, což mi říkáš, že je nemožné.“ Zvedla jsem prst. „Nebo přišli na totéž tajemství z druhé strany. Ze strany Blackburnových. Protože Blackburnovi ztratili v roce 1924 brož, že ano. Taková rodina, ti si to museli poznamenat. Dopis, účetnictví domácnosti, vzkaz pro pojišťováka, něco takového. Jejich verze příběhu někde existuje, oddělená od té tvojí.“</w:t>
+        <w:t xml:space="preserve">„Tak přemýšlej chvíli se mnou,“ řekla jsem, „protože na tomhle záleží víc než na čemkoliv jiném. Kdo tenhle vzkaz napsal, ví, co bylo v tom zamčeném kufru. A existují jen dva způsoby, jak může člověk zjistit, co je v zamčeném kufru, který jsi otevřela jen ty. Buď se jim nějak podařilo dostat se do tvého kufru, což mi říkáš, že je nemožné.“ Zvedla jsem prst. „Nebo přišli na totéž tajemství z druhé strany. Ze strany Blackburnových. Protože Blackburnovi ztratili v roce 1924 brož, že ano. Taková rodina, ti si to museli poznamenat. Dopis, účetnictví domácnosti, vzkaz pro pojišťováka, něco takového. Jejich verze příběhu někde existuje, oddělená od té tvojí.“</w:t>
       </w:r>
     </w:p>
     <w:p/>
@@ -771,7 +771,7 @@
     <w:p/>
     <w:p>
       <w:r>
-        <w:t xml:space="preserve">Zacvrlikala a zařadila se mi po boku. Šly jsme domů probouzejícím se městem a já celou cestu držela ruku přitisknutou na vzkazu a ani jednou se nepodívala nahoru na festivalová světla podél střech.</w:t>
+        <w:t xml:space="preserve">Zacvrlikala a zařadila se mi po boku. Šly jsme domů probouzejícím se městem a já celou cestu držela ruku přitisknutou na vzkazu a ani jednou se nepodívala nahoru na festivalová světla podél okapů.</w:t>
       </w:r>
     </w:p>
     <w:p>
@@ -1138,7 +1138,7 @@
     <w:p/>
     <w:p>
       <w:r>
-        <w:t>„Paní Clausová.“ Neil ani nezvedl hlavu od skla. „Fascinující, tohle všechno. Váš pan Hussein prokázal městu obrovskou službu, ať už to město ví, nebo ne. Podívejte se na tohle.“ Ukázal na vitrínu, přičemž se jedním prstem skla sotva dotkl. „Celá korespondence ohledně chodu domácnosti. Kdo byl najat, kdo byl propuštěn, co se koupilo, co se prodalo.“ Pak otočil hlavu a objevil se úsměv. „A co se ztratilo.“</w:t>
+        <w:t>„Paní Clausová.“ Neil ani nezvedl hlavu od skla. „Fascinující, tohle všechno. Váš pan Hussein prokázal městu obrovskou službu, ať už to město ví, nebo ne. Podívejte se na tohle.“ Ukázal na vitrínu, přičemž se prstem skla tak docela nedotkl. „Celá korespondence ohledně chodu domácnosti. Kdo byl najat, kdo byl propuštěn, co se koupilo, co se prodalo.“ Pak otočil hlavu a objevil se úsměv. „A co se ztratilo.“</w:t>
       </w:r>
     </w:p>
     <w:p/>
@@ -1162,7 +1162,7 @@
     <w:p/>
     <w:p>
       <w:r>
-        <w:t>Vtom ťukl Theo lžičkou do skleničky v přední části síně. Dav se otočil, ztišil a on pronesl svých pár slov, která zrovna krátká nebyla. O minulosti zkrátka nedokázal mluvit stručně. Jmenovitě poděkoval všem dobrovolníkům, úplně každému, včetně paní Pelletierové, která údajně tři víkendy v kuse třídila fotografie a při zmínce jejího jména se celá začervenala. Poděkoval městu. S pohnutím v hlase poděkoval „každému, kdo kdy schoval dopis místo toho, aby ho vyhodil, protože o tom nakonec celá historie je – o věcech, které lidé nedokázali unést a vyhodit“.</w:t>
+        <w:t>Vtom ťukl Theo lžičkou do skleničky v přední části síně. Dav se otočil, ztišil a on pronesl svých pár slov, která zrovna krátká nebyla. O minulosti zkrátka nedokázal mluvit stručně. Jmenovitě poděkoval všem dobrovolníkům, úplně každému, včetně paní Pelletierové, která údajně tři víkendy v kuse třídila fotografie a při zmínce jejího jména se celá začervenala. Poděkoval městu. S pohnutím v hlase poděkoval „každému, kdo kdy schoval dopis místo toho, aby ho vyhodil, protože o tom nakonec celá historie je – o věcech, které lidé neměli srdce vyhodit“.</w:t>
       </w:r>
     </w:p>
     <w:p/>
@@ -1210,7 +1210,7 @@
     <w:p/>
     <w:p>
       <w:r>
-        <w:t>Já důvod měla. Den předtím jsem držela v ruce list naprosto stejného papíru, na kterém byla špatně napodobeným písmem napsaná žádost o půl milionu dolarů.</w:t>
+        <w:t>Já důvod měla. Den předtím jsem držela v ruce list naprosto stejného papíru, na kterém byla špatně napodobeným písmem napsaný požadavek půl milionu dolarů.</w:t>
       </w:r>
     </w:p>
     <w:p/>
@@ -1301,7 +1301,7 @@
     </w:p>
     <w:p>
       <w:r>
-        <w:t xml:space="preserve">Probíraly festivalové palčáky, palčáky se jmény na manžetách, které kroužek každý rok pletl pro školáky, přičemž každý pár vznikal v barvách školy a se jménem dítěte přes manžetu, aby se žádný palčák nikdy nevrátil domů s nesprávným dítětem. Claire zvedla napůl upletený palčák v barvě jedličkové zeleně a otáčela jím proti světlu.</w:t>
+        <w:t xml:space="preserve">Pracovaly na festivalových palčácích, palčácích se jmény na manžetách, které kroužek každý rok pletl pro školáky, přičemž každý pár vznikal v barvách školy a se jménem dítěte přes manžetu, aby se žádný palčák nikdy nevrátil domů s nesprávným dítětem. Claire zvedla napůl upletený palčák v barvě jedličkové zeleně a otáčela jím proti světlu.</w:t>
       </w:r>
     </w:p>
     <w:p>
@@ -1351,7 +1351,7 @@
     </w:p>
     <w:p>
       <w:r>
-        <w:t>„Nespí,“ pronesla Martha a ta strohost v jejím hlase přiměla všechny zvednout hlavy. Martha učila v tomhle městě čtyřicet let a měla ve zvyku položit tvrdý fakt doprostřed stolu, aby ho každý viděl takový, jaký je, naprosto jasně a bez příkras. „V úterý večer jsem mu nesla zapékané těstoviny. Dveře byly odemčené, tak jsem vešla dovnitř a našla ho spát za stolem v zadní místnosti s brýlemi na očích a vedle něj ležel ztvrdlý sendvič, kterého se ani netkl. Neměla jsem to srdce ho budit. Nechala jsem tam jídlo a vzkaz a po špičkách odešla.“ Přehmátla si očko. „On tam žije. V té budově. Přestal chodit domů.“</w:t>
+        <w:t>„Nespí,“ pronesla Martha a ta strohost v jejím hlase přiměla všechny zvednout hlavy. Martha učila v tomhle městě čtyřicet let a měla ve zvyku položit tvrdý fakt doprostřed stolu, aby ho každý viděl takový, jaký je, naprosto jasně a bez příkras. „V úterý večer jsem mu nesla zapékané těstoviny. Dveře byly odemčené, tak jsem vešla dovnitř a našla ho spát za stolem v zadní místnosti s brýlemi na očích a vedle něj ležel ztvrdlý sendvič, kterého se ani netkl. Neměla jsem to srdce ho budit. Nechala jsem tam jídlo a vzkaz a po špičkách odešla.“ Nabrala očko. „On tam žije. V té budově. Přestal chodit domů.“</w:t>
       </w:r>
     </w:p>
     <w:p>
@@ -1445,7 +1445,7 @@
     </w:p>
     <w:p>
       <w:r>
-        <w:t xml:space="preserve">„Mhm.“ Martha nebyla žádná hloupá husa. Nechala to mhm chvíli viset ve vzduchu, nevěřila mi a přitom netlačila na pilu. „Vyřiď jí, že tu kroužek je, kdykoliv nás bude potřebovat. Jsme staré, ale ne zbytečné. Není v tomhle městě trápení, které bychom s někým už neproseděly.“ Pak zase odložila jehlice, natáhla ruku a položila svou skvrnitou, pevnou starou dlaň na moje koleno. „A ty, Jessico. Máš ten pohled. Ten, co jsi měla před pár týdny kvůli tomu Redfernovic klukovi, když jsi to odmítla nechat být, zatímco zbytek z nás si myslel, že bys měla. Něco v sobě nosíš.“</w:t>
+        <w:t xml:space="preserve">„Mhm.“ Martha nebyla žádná hloupá husa. Nechala to mhm chvíli viset ve vzduchu, nevěřila mi a přitom netlačila na pilu. „Vyřiď jí, že tu kroužek je, kdykoliv nás bude potřebovat. Jsme staré, ale ne zbytečné. Není v tomhle městě trápení, které bychom s někým už neproseděly.“ Pak zase odložila jehlice, natáhla ruku a položila svou skvrnitou, pevnou starou dlaň na moje koleno. „A ty, Jessico. Máš ten pohled. Ten, co jsi měla před pár týdny kvůli té Redfernovic holčičce, když jsi to odmítla nechat být, zatímco zbytek z nás si myslel, že bys měla. Něco v sobě nosíš.“</w:t>
       </w:r>
     </w:p>
     <w:p>
@@ -1460,7 +1460,7 @@
     </w:p>
     <w:p>
       <w:r>
-        <w:t>To mě zasáhlo přímo do živého. Byla to Martha Green, která pochovala manžela a naučila polovinu Frost Falls abecedě, kdo mi říkal, že patřím do party natolik, abych se mohla o někoho opřít.</w:t>
+        <w:t>To mě zasáhlo přímo do živého. Byla to Martha Greenová, která pochovala manžela a naučila polovinu Frost Falls abecedě, kdo mi říkal, že patřím do party natolik, abych se mohla o někoho opřít.</w:t>
       </w:r>
     </w:p>
     <w:p>
@@ -1597,7 +1597,7 @@
     <w:p/>
     <w:p>
       <w:r>
-        <w:t xml:space="preserve">„Jak se máš, Marku?“ zeptala jsem se ho potichu, když jsme šli příště kolem sebe, zatímco Emma vyjednávala křehký mír mezi Snowballem a tykví, která se ho dotkla.</w:t>
+        <w:t xml:space="preserve">„Jak se máš, Marku?“ zeptala jsem se ho potichu, když jsme šli příště kolem sebe, zatímco Emma vyjednávala křehký mír mezi Snowballem a tykví, která ho urazila.</w:t>
       </w:r>
     </w:p>
     <w:p/>
@@ -1705,7 +1705,7 @@
     <w:p/>
     <w:p>
       <w:r>
-        <w:t>Měla bych mít obavy a malá, opatrná část mě je měla. Ale zbytek mě klečel ve studené trávě s uzdravující se dívkou, snítkou nemožné cesmíny, psem v čepici s parohy a tučňákem s dýní na bradě, a navzdory všemu, co jsem věděla o tom, jak být rozumná, jsem byla ráda.</w:t>
+        <w:t>Měla jsem mít obavy a malá, opatrná část mě je měla. Ale zbytek mě klečel ve studené trávě s uzdravující se dívkou, snítkou nemožné cesmíny, psem v čepici s parohy a tučňákem s dýní na bradě, a navzdory všemu, co jsem věděla o tom, jak být rozumná, jsem byla ráda.</w:t>
       </w:r>
     </w:p>
     <w:p/>
@@ -1820,7 +1820,7 @@
     </w:p>
     <w:p>
       <w:r>
-        <w:t>To z ní dostalo opravdový smích, ten hluboký, který propukne najednou, smích, který mi tak chyběl, a slyšet ho mi udělalo stejně dobře jako jí ta polévka. Vrátily jsme se k židlím společně. Já počítala, zatímco ona spravovala ty viklavé, a Pip na to všechno dohlížela z teplého slunečního fleku. Na celou hodinu se hostinec zase stal obyčejným hostincem, hřejivým a živým, který se připravuje na festival. Ať už se stalo cokoliv jiného, tohle stálo za to ochránit: teplo, které vyděšená holka vytvořila z ničeho a předala přes sto let dál jiné ženě počítající židle.</w:t>
+        <w:t>To z ní dostalo opravdový smích, ten hluboký, který propukne najednou, smích, který mi tak chyběl, a slyšet ho mi udělalo stejně dobře jako jí ta polévka. Vrátily jsme se k židlím společně. Já počítala, zatímco ona spravovala ty viklavé, a Pip na to všechno dohlížela z teplého slunečního fleku. Na celou hodinu se hostinec zase stal obyčejným hostincem, hřejivým a živým, který se připravuje na festival. Ať už se stane cokoliv jiného, tohle stálo za to ochránit: teplo, které vyděšená holka vytvořila z ničeho a předala přes sto let dál jiné ženě počítající židle.</w:t>
       </w:r>
     </w:p>
     <w:p>
@@ -1980,7 +1980,7 @@
     <w:p/>
     <w:p>
       <w:r>
-        <w:t xml:space="preserve">„Děkuji vám, Same,“ řekla jsem a zaplatila mu za držák, a to poděkování patřilo mnohem víc než jen za tu věc. „Za tu práci. A za to, že jste se na ni tak upřímně vyptával. Vyřídím jí to. Laskavě.“</w:t>
+        <w:t xml:space="preserve">„Děkuji vám, Same,“ řekla jsem a zaplatila mu za držák, a to poděkování nebylo jen za ten držák. „Za tu práci. A za to, že jste se na ni tak upřímně vyptával. Vyřídím jí to. Laskavě.“</w:t>
       </w:r>
     </w:p>
     <w:p/>
@@ -2136,7 +2136,7 @@
     <w:p/>
     <w:p>
       <w:r>
-        <w:t xml:space="preserve">„Paní Clausová!“ Bram přiběhl zpoza rohu chalupy v poklusu a mnul si čapku v dlaních. Bram byl skřítek, který s námi přišel na jih, mistr přesunuté dílny, oddaný, úzkostlivý a postavený zhruba podle vzoru ustarané brambory, a teď byl v nejvyšším stupni rozrušení. „Je to Dancer. Zase se pustila ven. Už potřetí tento týden, paní Clausová, potřetí. A přísahám na každý knoflík, co mám, že ta závora byla zapadlá, když jsem od ní odcházel, zapadlá a vyzkoušená, a teď je tady, žere dobré zelí a nedá se vzít na ohlávku, a vůbec se mi to nelíbí, to ti teda povídám.“</w:t>
+        <w:t xml:space="preserve">„Paní Clausová!“ Bram přiběhl zpoza rohu chalupy v poklusu a mnul si čapku v dlaních. Bram byl skřítek, který s námi přišel na jih, předák přesunuté dílny, oddaný, úzkostlivý a postavený zhruba podle vzoru ustarané brambory, a teď byl v nejvyšším stupni rozrušení. „Je to Dancer. Zase se pustila ven. Už potřetí tento týden, paní Clausová, potřetí. A přísahám na každý knoflík, co mám, že ta závora byla zapadlá, když jsem od ní odcházel, zapadlá a vyzkoušená, a teď je tady, žere dobré zelí a nedá se vzít na ohlávku, a vůbec se mi to nelíbí, to ti teda povídám.“</w:t>
       </w:r>
     </w:p>
     <w:p/>
@@ -2309,7 +2309,7 @@
     </w:p>
     <w:p>
       <w:r>
-        <w:t xml:space="preserve">Chvilku měl a věnoval mi ji zpoza svého čistého stolu, aniž by se namáhal vstát. Udělala jsem pro Společnost, co bylo v mých silách. O střeše, do které zatéká v zadních místnostech. O kotli, který má před sebou svou poslední zimu. Dvě stě let městské paměti pomalu chátrá jen proto, že chybí zlomek toho, co město utratí za jediný festivalový víkend. Mluvila jsem vřele a stručně. Claire mi říkala, že smutné příběhy peníze neuvolní, a já se snažila o něco stálejšího a hůře odmítnutelného než pouhý smutek.</w:t>
+        <w:t xml:space="preserve">Chvilku měl a věnoval mi ji zpoza svého čistého stolu, aniž by se namáhal vstát. Přimlouvala jsem se za Společnost, jak nejlépe jsem uměla. O střeše, do které zatéká v zadních místnostech. O kotli, který má před sebou svou poslední zimu. Dvě stě let městské paměti pomalu chátrá jen proto, že chybí zlomek toho, co město utratí za jediný festivalový víkend. Mluvila jsem vřele a stručně. Claire mi říkala, že smutné příběhy peníze neuvolní, a já se snažila o něco stálejšího a hůře odmítnutelného než pouhý smutek.</w:t>
       </w:r>
     </w:p>
     <w:p>
@@ -2483,7 +2483,7 @@
     <w:p/>
     <w:p>
       <w:r>
-        <w:t xml:space="preserve">„To říká aritmetika.“ Theo si sundal brýle a přitiskl si prsty ke kořenu nosu a jeho pečlivý hlas na okamžik zaváhal. „Žádal jsem všude. Chci, abyste to všichni věděli. Každá dotace, každá nadace, každý fond ve třech státech. Mám složku plnou zamítavých odpovědí. Mohl bych s nimi vytapetovat tenhle pokoj a aspoň by tu bylo sucho.“ Několik lidí se zasmálo, tím smutným, bezmocným smíchem lidí, kterým došly možnosti. „Město nepomůže. Sám jsem za starostou zašel loni na jaře a paní Clausová tu byla dnes ráno znovu, a říká pořád to samé. Historie silnice neprohrne.“ Položil brýle na papíry. „Nevím, co jiného ještě zkusit. Zkoušel jsem být rozumný. Zkoušel jsem prosit. Nestydím se vám říct, že jsem zkoušel prosit písemně jednu nadaci ve městě a oni mi poslali velmi vlídný dopis, že ne.“</w:t>
+        <w:t xml:space="preserve">„To říká aritmetika.“ Theo si sundal brýle a přitiskl si prsty ke kořenu nosu a jeho pečlivý hlas na okamžik zaváhal. „Žádal jsem všude. Chci, abyste to všichni věděli. Každá dotace, každá nadace, každý fond ve třech státech. Mám složku plnou zamítavých odpovědí. Mohl bych s nimi vytapetovat tenhle pokoj a aspoň by tu bylo sucho.“ Několik lidí se zasmálo, tím smutným, bezmocným smíchem lidí, kterým došly možnosti. „Město nepomůže. Sám jsem za starostou zašel loni na jaře a paní Clausová, která tu sedí, za ním byla dnes ráno znovu, a on říká pořád to samé. Historie silnice neprohrne.“ Položil brýle na papíry. „Nevím, co jiného ještě zkusit. Zkoušel jsem být rozumný. Zkoušel jsem prosit. Nestydím se vám říct, že jsem zkoušel prosit písemně jednu nadaci ve městě a oni mi poslali velmi vlídný dopis, že ne.“</w:t>
       </w:r>
     </w:p>
     <w:p/>
@@ -2578,7 +2578,7 @@
     <w:p/>
     <w:p>
       <w:r>
-        <w:t>Úsměv vydržel, ale stálo ho to nějakou námahu. — Pomalu, — připustil. — Banka na té půjčce sedí. Už třetí měsíc. Pokaždé, když si myslím, že jsme u cíle, chtějí další formulář, další číslo, další měsíc výpisů. — Odvrátil pohled a zadíval se přes jasnou, novou podlahu. — Nebudu vám lhát, paní Clausová, je to těžké. Vrazil jsem do tohohle místa všechno. Všechno, co jsem měl, a velký kus toho, co jsem neměl. Jsou noci, kdy dělám počty a pak tu ležím a nespím.</w:t>
+        <w:t>Úsměv vydržel, ale stálo ho to nějakou námahu. „Pomalu,“ připustil. „Banka na té půjčce sedí. Už třetí měsíc. Pokaždé, když si myslím, že jsme u cíle, chtějí další formulář, další číslo, další měsíc výpisů.“ Odvrátil pohled a zadíval se přes jasnou, novou podlahu. „Nebudu vám lhát, paní Clausová, je to těžké. Vrazil jsem do tohohle místa všechno. Všechno, co jsem měl, a velký kus toho, co jsem neměl. Jsou noci, kdy dělám počty a pak ležím a nespím.“</w:t>
       </w:r>
     </w:p>
     <w:p/>
@@ -2596,7 +2596,7 @@
     <w:p/>
     <w:p>
       <w:r>
-        <w:t xml:space="preserve">Nechala jsem to v sobě doznít tak, jako jsem nechala doznít Samových dvacet dolarů. Tady byl muž hluboce v dluzích, se všemi důvody na světě a se všemi příležitostmi k tomu. Jeho odpovědí bylo, že celou noc střežil městský festival za honorář a učil babičky dělat výpady v půl šesté ráno. Jamal pracoval na tři úvazky, aby se vyhrabal ze své šlamastyky čestným, vysilujícím, milimetrovým způsobem, a to se s vyděračským vzkazem na půl milionu dolarů zkrátka neslučovalo. Ty počty neseděly. Kdyby měl Jamal Washington jakoukoli možnost vyčarovat takové peníze z nějakého tajemství, nenařizoval by si budík na pět hodin.</w:t>
+        <w:t xml:space="preserve">Nechala jsem to v sobě doznít tak, jako jsem nechala doznít Samových dvacet dolarů. Tady byl muž hluboce v dluzích, se všemi důvody na světě a se všemi příležitostmi k tomu. Jeho odpovědí bylo, že bude celou noc za honorář střežit městský festival a učit babičky dělat výpady v půl šesté ráno. Jamal pracoval na tři úvazky, aby se vyhrabal ze své šlamastyky čestným, vysilujícím, milimetrovým způsobem, a to se s vyděračským vzkazem na půl milionu dolarů zkrátka neslučovalo. Ty počty neseděly. Kdyby měl Jamal Washington jakoukoli možnost vyčarovat takové peníze z nějakého tajemství, nenařizoval by si budík na pět hodin.</w:t>
       </w:r>
     </w:p>
     <w:p/>
@@ -2757,7 +2757,7 @@
     <w:p/>
     <w:p>
       <w:r>
-        <w:t>Přistoupila jsem ke kašně, položila ruku na Prancerin teplý krk a naklonila se k ní. — Nic na téhle návsi není ani zdaleka tak teplé jako doma, — řekla jsem tiše, jen pro ni. — Jestli chceš teplo, běž domů. Běž se podívat.</w:t>
+        <w:t>Přistoupila jsem ke kašně, položila ruku na Prancerin teplý krk a naklonila se k ní. „Nic na téhle návsi není ani zdaleka tak teplé jako doma,“ řekla jsem tiše, jen pro ni. „Jestli chceš teplo, běž domů. Běž se podívat.“</w:t>
       </w:r>
     </w:p>
     <w:p/>
@@ -2799,7 +2799,7 @@
     <w:p/>
     <w:p>
       <w:r>
-        <w:t xml:space="preserve">Mělo mě to znepokojovat víc, než tomu bylo ve skutečnosti. Ve městě řádil vyděrač a moje kamarádka byla tlačena ke zdi kvůli půl milionu dolarů. Jenže sobice právě vylezla z kašny, protože jsem jí řekla, že o kousek dál v uličce je něco hřejivého. Děti jí jásaly celou cestu až za roh. Moje srdce, navzdory všem faktům, stoupalo vzhůru jako drak.</w:t>
+        <w:t xml:space="preserve">Mělo mě to znepokojovat víc, než tomu bylo ve skutečnosti. Ve městě řádil vyděrač a moje kamarádka byla tlačena ke zdi kvůli půl milionu dolarů. Jenže sobice právě vylezla z kašny, protože jsem jí řekla, že o kousek dál v uličce je něco hřejivějšího. Děti jí jásaly celou cestu až za roh. Moje srdce, navzdory všem faktům, stoupalo vzhůru jako drak.</w:t>
       </w:r>
     </w:p>
     <w:p>
@@ -3012,7 +3012,7 @@
     <w:p/>
     <w:p>
       <w:r>
-        <w:t xml:space="preserve">Jména jsem napsala do sloupce vlevo. Sam. Neil. Jamal. Vera. Theo. A nahoru napříč jsem poznamenala jediné dvě otázky, na kterých záleželo, dvě věci, na které musel vyděrač odpovědět kladně – na obě, jinak to on nebyl. </w:t>
+        <w:t xml:space="preserve">Jména jsem napsala do sloupce vlevo. Sam. Neil. Jamal. Vera. Theo. A nahoru napříč jsem poznamenala jediné dvě otázky, na kterých záleželo, dvě věci, na které musel vyděrač odpovědět kladně – na obě, jinak to nebyli oni. </w:t>
       </w:r>
       <w:r>
         <w:rPr>
@@ -3250,7 +3250,7 @@
     <w:p/>
     <w:p>
       <w:r>
-        <w:t>„Skutečná firma,“ spustila, ještě než jsem vůbec stihla říct haló. „Stará, dva státy odtud, dělá přesně to, co ten tvůj chlapík říká, že dělá – pozůstalosti, dědictví a pátrání po ztraceném majetku pro právníky, co mají víc peněz než času. A vážně tu je Blackburnova pozůstalost, Jessiko, skutečná, aktuální. Poslední z linie Adelaide Blackburnové zemřela dole ve městě letos na jaře, žádné děti, žádná kloudná závěť a zbylo z toho neskutečné klubko. Náš starosta je z příbuzenské větve, z té, co po nich zdědila akorát tak nos, ale peníze ani náhodou. Do toho on není zapletený. Carter je vedený v účetnictví firmy jako rešeršér, kterého najali, aby se v tom probral. Vytáhla jsem to z jedné úřednice, která mi to celé potvrdila, aniž by si byť jen jednou uvědomila, že něco potvrzuje. Je přesně, do puntíku tím, za co se ti vydával. Pátrač s licencí a výdajovým účtem.“</w:t>
+        <w:t>„Skutečná firma,“ spustila, ještě než jsem vůbec stihla říct haló. „Stará, dva státy odtud, dělá přesně to, co ten tvůj chlapík říká, že dělá – pozůstalosti, dědictví a pátrání po ztraceném majetku pro právníky, co mají víc peněz než času. A vážně tu je Blackburnova pozůstalost, Jessiko, skutečná, aktuální. Poslední z linie Adelaide Blackburnové zemřela dole ve městě letos na jaře, žádné děti, žádná kloudná závěť a zbylo z toho neskutečné klubko. Náš starosta je z příbuzenské větve, z té, co po nich zdědila akorát tak nos, ale peníze ani náhodou. Do toho on není zapletený. Carter je vedený v účetnictví firmy jako rešeršér, kterého najali, aby se v tom probral. Vytáhla jsem to z jedné úřednice, která mi to celé potvrdila, aniž by si byť jen jednou uvědomila, že něco potvrzuje. Je přesně, do puntíku tím, co ti o sobě řekl. Pátrač s licencí a výdajovým účtem.“</w:t>
       </w:r>
     </w:p>
     <w:p/>
@@ -3471,7 +3471,7 @@
     <w:p/>
     <w:p>
       <w:r>
-        <w:t xml:space="preserve">„Vím, že to vzešlo od něj nebo přes něj.“ Hlas mi zněl drsně. „Vím, že kdokoli ten vzkaz napsal, četl Theova vlastní slova o té broži. A vím, že existuje jen krátký seznam lidí, kteří k nim měli přístup, a jeho jméno stojí na samém vrcholu, vymalované červenou tužkou, jeho vlastním písmem.“ Přitáhla jsem si deku blíž. „Pořád ho vidím stát před chvílí u dveří. Čtyřicet nových členů. Tak šťastného. Nicku, jak to může člověk udělat? Jak může tohle provést Fioně ve stínu a ráno dětem přinést kakao a myslet obojí vážně, ve stejný týden, stejnýma rukama?“</w:t>
+        <w:t xml:space="preserve">„Vím, že to vzešlo od něj nebo přes něj.“ Hlas mi zněl drsně. „Vím, že kdokoli ten vzkaz napsal, četl Theova vlastní slova o té broži. A vím, že existuje jen krátký seznam lidí, kteří k nim měli přístup, a jeho jméno stojí na samém vrcholu, napsané červenou tužkou, jeho vlastním písmem.“ Přitáhla jsem si deku blíž. „Pořád ho vidím stát před chvílí u dveří. Čtyřicet nových členů. Tak šťastného. Nicku, jak to může člověk udělat? Jak může tohle provést Fioně ve stínu a ráno dětem přinést kakao a myslet obojí vážně, ve stejný týden, stejnýma rukama?“</w:t>
       </w:r>
     </w:p>
     <w:p/>
@@ -3525,13 +3525,13 @@
     <w:p/>
     <w:p>
       <w:r>
-        <w:t>„Krb,“ pronesla jsem sotva slyšitelně.</w:t>
-      </w:r>
-    </w:p>
-    <w:p/>
-    <w:p>
-      <w:r>
-        <w:t xml:space="preserve">„Krb.“ Jeho paže mě objala kolem ramene. „Ještě není hotový. Ještě to neunese, ne všechno, ne natrvalo. To je práce na léta, Jess. Ale je to začátek. Místo, kam se může uchýlit. Aby už nemuselo prohledávat temnotu.“ Podíval se na mě, ve tváři se mu míhalo zlaté světlo. „Chtěl jsem, abys to dneska večer viděla, protože v sobě nosíš strašnou tíhu a já nechtěl, abys chodila po světě s pocitem, že všichni lidé dělají jen zlo ve tmě. Někteří z nás jsou venku v té temnotě taky a budují místa, kde se teplo může zachytit.“</w:t>
+        <w:t>„Ohniště,“ pronesla jsem sotva slyšitelně.</w:t>
+      </w:r>
+    </w:p>
+    <w:p/>
+    <w:p>
+      <w:r>
+        <w:t xml:space="preserve">„Ohniště.“ Jeho paže mě objala kolem ramene. „Ještě není hotové. Ještě to neunese, ne všechno, ne natrvalo. To je práce na léta, Jess. Ale je to začátek. Místo, kam se může uchýlit. Aby už nemuselo prohledávat temnotu.“ Podíval se na mě, ve tváři se mu míhalo zlaté světlo. „Chtěl jsem, abys to dneska večer viděla, protože v sobě nosíš strašnou tíhu a já nechtěl, abys chodila po světě s pocitem, že všichni lidé dělají jen zlo ve tmě. Někteří z nás jsou venku v té temnotě taky a budují místa, kde se teplo může zachytit.“</w:t>
       </w:r>
     </w:p>
     <w:p/>
@@ -3680,7 +3680,7 @@
     <w:p/>
     <w:p>
       <w:r>
-        <w:t>Tím bylo nade vší pochybnost vyřešeno kde a téměř i kdo. V břiše mi z toho ztěžklo a zastudilo, protože po návštěvě archivu jsem už věděla, číma rukama ty dopisy prošly. Jenže když jsem tak seděla v tom chladném malém pokojíčku, narazila jsem na věc, která mi nešla do hlavy a odmítala do sebe zapadnout, ať jsem ji otáčela jakkoliv.</w:t>
+        <w:t>Tím bylo nade vší pochybnost vyřešeno kde a téměř i kdo. V břiše mi z toho ztěžklo a zastudilo, protože po návštěvě archivu jsem už věděla, čími rukama ty dopisy prošly. Jenže když jsem tak seděla v tom chladném malém pokojíčku, narazila jsem na věc, která mi nešla do hlavy a odmítala do sebe zapadnout, ať jsem ji otáčela jakkoliv.</w:t>
       </w:r>
     </w:p>
     <w:p/>
@@ -3926,7 +3926,7 @@
     <w:p/>
     <w:p>
       <w:r>
-        <w:t xml:space="preserve">Seděla jsem tiše ve světle lampy. Krádež brože a koupě hostince byly dvě různá tajemství, uložená ve dvou různých budovách. Theo měl jedno z nich. Měl archiv, dopisy, katalogovou kartu, dopisní papír. Měl krádež. Ale důkaz, že ukradené peníze se staly tímto milovaným hostincem, byl na radnici, v majetkových záznamech, o nichž se mi jedna upjatá, unavená žena podívala do očí a přísahala, že je nikdy nečte.</w:t>
+        <w:t xml:space="preserve">Seděla jsem tiše ve světle lampy. Krádež brože a koupě hostince byly dvě různá tajemství, uložená ve dvou různých budovách. Theo měl jedno z nich. Měl archiv, dopisy, katalogovou kartu, dopisní papír. Měl tajemství krádeže. Ale důkaz, že ukradené peníze se staly tímto milovaným hostincem, byl na radnici, v majetkových záznamech, o nichž se mi jedna upjatá, unavená žena podívala do očí a přísahala, že je nikdy nečte.</w:t>
       </w:r>
     </w:p>
     <w:p/>
@@ -4042,7 +4042,7 @@
     <w:p/>
     <w:p>
       <w:r>
-        <w:t>Theo měl krádež. Našel ji v Blackburnových dopisech, brož, kámen, zastavárnu. Pečlivým písmem ji zanesl do katalogu, safír v jejím srdci, a pak ty dopisy vytáhl ze spisů a označil je za pohřešované. Ale Theo, který se potápěl pod hladinou, sledovaný celým městem, a který nebyl nikdy doma, nemohl udělat zbytek. Nemohl potvrdit, že hostinec byl koupen za ty peníze, protože ten důkaz v jeho budově nebyl. A nemohl roznést vzkazy napříč městem a položit jeden na přeplněný stůl za bílého dne uprostřed slavností, protože Theo Hussein se nemohl projít po Evergreen Avenue bez povšimnutí, ani kdyby mu to zachránilo život.</w:t>
+        <w:t>Theo věděl o krádeži. Našel ji v Blackburnových dopisech, brož, kámen, zastavárnu. Pečlivým písmem ji zanesl do katalogu, safír v jejím srdci, a pak ty dopisy vytáhl ze spisů a označil je za pohřešované. Ale Theo, který se potápěl pod hladinou, sledovaný celým městem, a který nebyl nikdy doma, nemohl udělat zbytek. Nemohl potvrdit, že hostinec byl koupen za ty peníze, protože ten důkaz v jeho budově nebyl. A nemohl roznést vzkazy napříč městem a položit jeden na přeplněný stůl za bílého dne uprostřed slavností, protože Theo Hussein se nemohl projít po Evergreen Avenue bez povšimnutí, ani kdyby mu to zachránilo život.</w:t>
       </w:r>
     </w:p>
     <w:p/>
@@ -4304,7 +4304,7 @@
     <w:p/>
     <w:p>
       <w:r>
-        <w:t>„Být v té místnosti,“ řekla jsem. „Jestli to uneseš. Ne abys někoho obviňovala. Jen tam být, aby se Theo musel podívat do tváře příteli, kterého se pokusil zranit, a abys ty přestala být tou, která s tím zůstala sama ve tmě. Nemusíš říct ani jediné slovo, jestli nechceš. Ale je to tvůj příběh, Fiono, víc než kohokoli jiného. Měla bys u toho být, až to konečně vyjde na světlo.“</w:t>
+        <w:t>„Být v té místnosti,“ řekla jsem. „Jestli to uneseš. Ne abys někoho obviňovala. Jen tam být, aby se Theo musel podívat do tváře přítelkyni, kterou se pokusil zranit, a abys ty přestala být tou, která s tím zůstala sama ve tmě. Nemusíš říct ani jediné slovo, jestli nechceš. Ale je to tvůj příběh, Fiono, víc než kohokoli jiného. Měla bys u toho být, až to konečně vyjde na světlo.“</w:t>
       </w:r>
     </w:p>
     <w:p/>
@@ -4381,7 +4381,7 @@
     <w:p/>
     <w:p>
       <w:r>
-        <w:t xml:space="preserve">„Namlouval jsem si, že to vlastně není krádež,“ řekl. „Ne Fioně. Namlouval jsem si, že ten hostinec byl stejně pořízený z ukradených peněz, takže vzít si z toho zpátky jen kousek nebyla krádež, byla to, já nevím, náprava historie, účet, který se konečně vyrovnává. Jsem tak dobrý v tom, že přinutím minulost znamenat cokoli, co zrovna potřebuju. To je celá moje průprava, dávat minulosti smysl.“ Zabořil si pěsti do očí jako dítě. „Střecha nám padá na hlavu. Kotel umírá. Sto let paměti tohohle města, každý dopis, každá fotografie a listina, všechno to jde vniveč a každé poctivé dveře, na které jsem zaklepal, mi zabouchli před nosem, starosta, dotace, nadace, všechny do jednoho. A pak jsem našel ty dopisy, a byl tam, půl milionu dolarů, jen tak ležel v minulosti, a já si pomyslel, já to můžu zachránit. Můžu zachránit úplně všechno, každý kousek, a nikdo vlastně nebude zraněný, protože ty peníze byly už na začátku špinavé.“ Vzhlédl, zbědovaný. „A pak jsem sledoval, co to s ní dělá. S Fionou. Sledoval jsem, jak šediví. A namlouval jsem si, že přestanu, a nepřestal jsem, protože v té době už jsem v tom vězel, a když už jsem to udělal jednou, říkal jsem si, že na jednom dalším nezáleží.“ Otočil se k Fioně a hlas se mu zlomil. „Je mi to tak líto. Je mi to tak líto, Fiono. Někde v tom všem jsem se ztratil. Mám historii tohohle města tak strašně rád, až jsem zapomněl, že město je tvořené živými lidmi.“</w:t>
+        <w:t xml:space="preserve">„Namlouval jsem si, že to vlastně není krádež,“ řekl. „Ne Fioně. Namlouval jsem si, že ten hostinec byl stejně pořízený z ukradených peněz, takže vzít si z toho zpátky jen kousek nebyla krádež, byla to, já nevím, náprava historie, účet, který se konečně vyrovnává. Jsem tak dobrý v tom, že přinutím minulost znamenat cokoli, co zrovna potřebuju. To je celá moje průprava, dávat minulosti smysl.“ Zabořil si pěsti do očí jako dítě. „Střecha nám padá na hlavu. Kotel umírá. Sto let paměti tohohle města, každý dopis, každá fotografie a listina, všechno to jde vniveč a každé poctivé dveře, na které jsem zaklepal, mi zabouchli před nosem, starosta, dotace, nadace, všechny do jednoho. A pak jsem našel ty dopisy, a bylo to tam, půl milionu dolarů, jen tak to leželo v minulosti, a já si pomyslel, já to můžu zachránit. Můžu zachránit úplně všechno, každý kousek, a nikdo vlastně nebude zraněný, protože ty peníze byly už na začátku špinavé.“ Vzhlédl, zbědovaný. „A pak jsem sledoval, co to s ní dělá. S Fionou. Sledoval jsem, jak šediví. A namlouval jsem si, že přestanu, a nepřestal jsem, protože v té době už jsem v tom vězel, a když už jsem to udělal jednou, říkal jsem si, že na jednom dalším nezáleží.“ Otočil se k Fioně a hlas se mu zlomil. „Je mi to tak líto. Je mi to tak líto, Fiono. Někde v tom všem jsem se ztratil. Mám historii tohohle města tak strašně rád, až jsem zapomněl, že město je tvořené živými lidmi.“</w:t>
       </w:r>
     </w:p>
     <w:p/>
@@ -4399,7 +4399,7 @@
     <w:p/>
     <w:p>
       <w:r>
-        <w:t xml:space="preserve">„Vero,“ řekla jsem. „Theo měl krádež. Ale ty vzkazy věděly, že hostinec byl koupený za peníze z té brože, a to v žádném dopise Blackburnových nikdy nebylo. To je majetkový záznam. Listina. A listina k tomuto hostinci ležela včera ráno vytažená ze zásuvky ve vašem košíku na vrácení, ohmataná, na stole ženy, která mi dvakrát řekla, že do záznamů za svými zády nikdy nenahlíží.“ Hlas jsem udržela měkký. „On měl krádež. Vy jste měla listinu. A vy jste měla nohy, Vero. On by nedokázal projít tímhle městem bez povšimnutí, ani kdyby šlo o život, Thea zná každý, každý ho zastaví. Ale nad tím, že se sekretářka starosty během festivalu zastaví v hostinci, nikdo ani nemrkne. Sama jsem vás toho rána potkala na schodech s parkovacími povolenkami. On by to sám nedokázal. Potřeboval někoho, kdo se dokáže městem pohybovat nepozorovaně. To jste byla vy.“</w:t>
+        <w:t xml:space="preserve">„Vero,“ řekla jsem. „Theo věděl o krádeži. Ale ty vzkazy věděly, že hostinec byl koupený za peníze z té brože, a to v žádném dopise Blackburnových nikdy nebylo. To je majetkový záznam. Listina. A listina k tomuto hostinci ležela včera ráno vytažená ze zásuvky ve vašem košíku na vrácení, ohmataná, na stole ženy, která mi dvakrát řekla, že do záznamů za svými zády nikdy nenahlíží.“ Hlas jsem udržela měkký. „On měl tajemství krádeže. Vy jste měla listinu. A vy jste měla nohy, Vero. On by nedokázal projít tímhle městem bez povšimnutí, ani kdyby šlo o život, Thea zná každý, každý ho zastaví. Ale nad tím, že se sekretářka starosty během festivalu zastaví v hostinci, nikdo ani nemrkne. Sama jsem vás toho rána potkala na schodech s parkovacími povolenkami. On by to sám nedokázal. Potřeboval někoho, kdo se dokáže městem pohybovat nepozorovaně. To jste byla vy.“</w:t>
       </w:r>
     </w:p>
     <w:p/>
@@ -4727,7 +4727,7 @@
     <w:p/>
     <w:p>
       <w:r>
-        <w:t xml:space="preserve">Slezla jsem z vrcholu světa napůl cizinkou a každé chladné ráno sahala po kabátě, který ještě nebyl nošený. A někde uprostřed té nejhorší aféry, jakou jsem ve Frost Falls zažila, v konání správné věci těžkým způsobem, se ten kabát rozseděl. Nikdo si nesedl a nerozhodl o tom. Milovala jsem to místo dost na to, abych pro něj udělala tu těžkou správnou věc. Lidé tady mě při tom sledovali a svým pomalým, bočním způsobem se rozhodli, že patřím k nim.</w:t>
+        <w:t xml:space="preserve">Slezla jsem z vrcholu světa napůl cizinkou a každé chladné ráno sahala po kabátě, který ještě nebyl nošený. A někde uprostřed té nejhorší aféry, jakou jsem ve Frost Falls zažila, v konání správné věci těžkým způsobem, mi ten kabát konečně padl jako ulitý. Nikdo si nesedl a nerozhodl o tom. Milovala jsem to místo dost na to, abych pro něj udělala tu těžkou správnou věc. Lidé tady mě při tom sledovali a svým pomalým, bočním způsobem se rozhodli, že patřím k nim.</w:t>
       </w:r>
     </w:p>
     <w:p/>
@@ -4917,7 +4917,7 @@
     <w:p/>
     <w:p>
       <w:r>
-        <w:t xml:space="preserve">U branky u Redfernů mi Emma vstrčila Snowballovo vodítko do ruky. „Počkej,“ řekla. „Nechoď pryč.“ Vběhla dovnitř a vrátila se se zavařovačkou v obou dlaních.</w:t>
+        <w:t xml:space="preserve">U branky u Redfernů mi Emma vstrčila Snowballovo vodítko do ruky. „Počkejte,“ řekla. „Nechoďte pryč.“ Vběhla dovnitř a vrátila se se zavařovačkou v obou dlaních.</w:t>
       </w:r>
     </w:p>
     <w:p/>
@@ -5304,7 +5304,7 @@
     <w:p/>
     <w:p>
       <w:r>
-        <w:t xml:space="preserve">Pak jsme se do toho pustily naplno, osm žen, krabice košíčků, tučňák a spící pes. Hovory plynuly dovnitř a ven z práce, jak už to v kroužku chodí, drobná dopolední novinka vměstnaná do prostor mezi vázáním snítek. Dceři Ivy dali novou práci v Concordu. Claire měla ve čtvrtek vyjít článek o harmonogramu pluhů, o kterém nám věrně slibovala, že je zajímavější, než zní. Martha říkala, že dny se teď zkracují tak rychle, že Emma chodí venčit Snowballa téměř za tmy, a já řekla, vyřiď dítěti moje pozdravy. Martha odvětila, že se Emma pořád ptá na Pip. A Pip, když uslyšela své jméno a správně si ho vyložila jako chválu, načepýřila peří a zatvářila se spokojeně.</w:t>
+        <w:t xml:space="preserve">Pak jsme se do toho pustily naplno, osm žen, krabice košíčků, tučňák a spící pes. Hovory plynuly dovnitř a ven z práce, jak už to v kroužku chodí, drobné novinky celého dopoledne vměstnané do mezer mezi vázáním snítek. Dceři Ivy dali novou práci v Concordu. Claire měla ve čtvrtek vyjít článek o harmonogramu pluhů, o kterém nám věrně slibovala, že je zajímavější, než zní. Martha říkala, že dny se teď zkracují tak rychle, že Emma chodí venčit Snowballa téměř za tmy, a já řekla, vyřiď dítěti moje pozdravy. Martha odvětila, že se Emma pořád ptá na Pip. A Pip, když uslyšela své jméno a správně si ho vyložila jako chválu, načepýřila peří a zatvářila se spokojeně.</w:t>
       </w:r>
     </w:p>
     <w:p/>
@@ -5376,7 +5376,7 @@
     <w:p/>
     <w:p>
       <w:r>
-        <w:t xml:space="preserve">Toho rána byl ten prostřední otočený úplně dokola.</w:t>
+        <w:t xml:space="preserve">Toho rána byl ten prostřední otočený čelem vzad.</w:t>
       </w:r>
     </w:p>
     <w:p/>

</xml_diff>

<commit_message>
WIP checkpoint: full proofcheck in progress (cross-book follow-ups)
Co-Authored-By: Claude Opus 5.5 <noreply@anthropic.com>
Claude-Session: https://claude.ai/code/session_012Cm8JxdqzjuttdUSdkQCUg
</commit_message>
<xml_diff>
--- a/translated/corrected/Inn Trouble - ASSEMBLED - FORMATTED_Czech.docx
+++ b/translated/corrected/Inn Trouble - ASSEMBLED - FORMATTED_Czech.docx
@@ -219,7 +219,7 @@
     </w:p>
     <w:p>
       <w:r>
-        <w:t xml:space="preserve">„Jessiko.“ I její hlas zněl falešně, byl tenký tam, kde měl hřát. „To jsi opravdu nemusela.“</w:t>
+        <w:t xml:space="preserve">„Jessico.“ I její hlas zněl falešně, byl tenký tam, kde měl hřát. „To jsi opravdu nemusela.“</w:t>
       </w:r>
     </w:p>
     <w:p>
@@ -3250,7 +3250,7 @@
     <w:p/>
     <w:p>
       <w:r>
-        <w:t>„Skutečná firma,“ spustila, ještě než jsem vůbec stihla říct haló. „Stará, dva státy odtud, dělá přesně to, co ten tvůj chlapík říká, že dělá – pozůstalosti, dědictví a pátrání po ztraceném majetku pro právníky, co mají víc peněz než času. A vážně tu je Blackburnova pozůstalost, Jessiko, skutečná, aktuální. Poslední z linie Adelaide Blackburnové zemřela dole ve městě letos na jaře, žádné děti, žádná kloudná závěť a zbylo z toho neskutečné klubko. Náš starosta je z příbuzenské větve, z té, co po nich zdědila akorát tak nos, ale peníze ani náhodou. Do toho on není zapletený. Carter je vedený v účetnictví firmy jako rešeršér, kterého najali, aby se v tom probral. Vytáhla jsem to z jedné úřednice, která mi to celé potvrdila, aniž by si byť jen jednou uvědomila, že něco potvrzuje. Je přesně, do puntíku tím, co ti o sobě řekl. Pátrač s licencí a výdajovým účtem.“</w:t>
+        <w:t xml:space="preserve">„Skutečná firma,“ spustila, ještě než jsem vůbec stihla říct haló. „Stará, dva státy odtud, dělá přesně to, co ten tvůj chlapík říká, že dělá – pozůstalosti, dědictví a pátrání po ztraceném majetku pro právníky, co mají víc peněz než času. A vážně tu je Blackburnova pozůstalost, Jessico, skutečná, aktuální. Poslední z linie Adelaide Blackburnové zemřela dole ve městě letos na jaře, žádné děti, žádná kloudná závěť a zbylo z toho neskutečné klubko. Náš starosta je z příbuzenské větve, z té, co po nich zdědila akorát tak nos, ale peníze ani náhodou. Do toho on není zapletený. Carter je vedený v účetnictví firmy jako rešeršér, kterého najali, aby se v tom probral. Vytáhla jsem to z jedné úřednice, která mi to celé potvrdila, aniž by si byť jen jednou uvědomila, že něco potvrzuje. Je přesně, do puntíku tím, co ti o sobě řekl. Pátrač s licencí a výdajovým účtem.“</w:t>
       </w:r>
     </w:p>
     <w:p/>
@@ -3602,7 +3602,7 @@
     <w:p/>
     <w:p>
       <w:r>
-        <w:t xml:space="preserve">„Ležel na recepci,“ vyhrkla hned, jakmile jsem prošla dveřmi. Zase nás zavřela v malém salonku a držela tu věc nataženou v délce paže, sevřenou mezi dvěma prsty, jako by ji to mohlo každou chvíli kousnout. „Prostě tam ležel. Mezi ranní poštou, jako by to byla složenka za plyn. Jessiko, on vešel do mé haly. Stál u mého vlastního pultu. Mohl to být kdokoliv, kdokoliv z hostů, kdokoliv z těch desítek lidí, co sem celý den kvůli festivalu proudí, a on stál přesně tam, kde odbavuju hosty, položil to mezi mou poštu a odešel, a já si ničeho nevšimla.“</w:t>
+        <w:t xml:space="preserve">„Ležel na recepci,“ vyhrkla hned, jakmile jsem prošla dveřmi. Zase nás zavřela v malém salonku a držela tu věc nataženou v délce paže, sevřenou mezi dvěma prsty, jako by ji to mohlo každou chvíli kousnout. „Prostě tam ležel. Mezi ranní poštou, jako by to byla složenka za plyn. Jessico, on vešel do mé haly. Stál u mého vlastního pultu. Mohl to být kdokoliv, kdokoliv z hostů, kdokoliv z těch desítek lidí, co sem celý den kvůli festivalu proudí, a on stál přesně tam, kde odbavuju hosty, položil to mezi mou poštu a odešel, a já si ničeho nevšimla.“</w:t>
       </w:r>
     </w:p>
     <w:p/>
@@ -4220,7 +4220,7 @@
     <w:p/>
     <w:p>
       <w:r>
-        <w:t xml:space="preserve">„Chápeš, že to musím řešit tak, jak to je,“ pronesla nakonec. „Vydírání je zločin, Jessiko. Dva vzkazy, požadavek na peníze, hrozba, že zničí ženu. To není nedorozumění, které bych mohla smést ze stolu přísným slovem. Jestli jsi mi to přinesla, nemůžu to vzít zpátky. To víš. Věděla jsi to, když jsi sem vstupovala.“</w:t>
+        <w:t xml:space="preserve">„Chápeš, že to musím řešit tak, jak to je,“ pronesla nakonec. „Vydírání je zločin, Jessico. Dva vzkazy, požadavek na peníze, hrozba, že zničí ženu. To není nedorozumění, které bych mohla smést ze stolu přísným slovem. Jestli jsi mi to přinesla, nemůžu to vzít zpátky. To víš. Věděla jsi to, když jsi sem vstupovala.“</w:t>
       </w:r>
     </w:p>
     <w:p/>
@@ -4238,7 +4238,7 @@
     <w:p/>
     <w:p>
       <w:r>
-        <w:t xml:space="preserve">„Způsob existuje,“ řekla. „Téměř vždycky existuje způsob, když lidé, kterých se to týká, nejsou monstra, a podle všeho, co jsi mi řekla, tihle dva monstra nejsou. Jsou to zoufalý muž a vyděšená žena, kteří udělali špatnou věc z důvodů, o nichž si víc než napůl namluvili, že jsou správné.“ Odložila propisku. „Tady je to, co neudělám. Nevyrazím dveře a nenasadím Theovi Husseinovi pouta uprostřed festivalu před celým městem. Nikomu to nepomůže, není to nutné a já nedělám nic tak krutého, když funguje něco laskavějšího.“ Podívala se na mě upřeně přes stůl. „Tady je to, co udělám. Dám mu šanci přiznat se, se mnou v místnosti, aby to bylo legální a zdokumentované. Pokud se k tomu přizná dobrovolně a napraví to, s odškodněním a skutečným vyrovnáním, pak je v tomhle prostoru naděje, že to neskončí zkázou. Říkáme tomu restorativní justice. Napravuje to, co se dá, namísto pouhého ničení toho, co zbylo. Funguje to ale jen tehdy, když je to pravda, Jessiko. Pokud bude lhát nebo se pokusí vykroutit postranními dveřmi, pak to půjde tou tvrdou cestou, a to je jeho volba, ne moje a ne tvoje.“</w:t>
+        <w:t xml:space="preserve">„Způsob existuje,“ řekla. „Téměř vždycky existuje způsob, když lidé, kterých se to týká, nejsou monstra, a podle všeho, co jsi mi řekla, tihle dva monstra nejsou. Jsou to zoufalý muž a vyděšená žena, kteří udělali špatnou věc z důvodů, o nichž si víc než napůl namluvili, že jsou správné.“ Odložila propisku. „Tady je to, co neudělám. Nevyrazím dveře a nenasadím Theovi Husseinovi pouta uprostřed festivalu před celým městem. Nikomu to nepomůže, není to nutné a já nedělám nic tak krutého, když funguje něco laskavějšího.“ Podívala se na mě upřeně přes stůl. „Tady je to, co udělám. Dám mu šanci přiznat se, se mnou v místnosti, aby to bylo legální a zdokumentované. Pokud se k tomu přizná dobrovolně a napraví to, s odškodněním a skutečným vyrovnáním, pak je v tomhle prostoru naděje, že to neskončí zkázou. Říkáme tomu restorativní justice. Napravuje to, co se dá, namísto pouhého ničení toho, co zbylo. Funguje to ale jen tehdy, když je to pravda, Jessico. Pokud bude lhát nebo se pokusí vykroutit postranními dveřmi, pak to půjde tou tvrdou cestou, a to je jeho volba, ne moje a ne tvoje.“</w:t>
       </w:r>
     </w:p>
     <w:p/>

</xml_diff>